<commit_message>
Upgrade DRDO Internship Report with high-res vector block diagrams, GeoServer admin screens, and detailed caption descriptions
</commit_message>
<xml_diff>
--- a/DRDO_Internship_Report.docx
+++ b/DRDO_Internship_Report.docx
@@ -4038,6 +4038,74 @@
     </w:p>
     <w:p>
       <w:pPr>
+        <w:jc w:val="center"/>
+      </w:pPr>
+      <w:r>
+        <w:drawing>
+          <wp:inline xmlns:a="http://schemas.openxmlformats.org/drawingml/2006/main" xmlns:pic="http://schemas.openxmlformats.org/drawingml/2006/picture">
+            <wp:extent cx="5486400" cy="2873829"/>
+            <wp:docPr id="1" name="Picture 1"/>
+            <wp:cNvGraphicFramePr>
+              <a:graphicFrameLocks noChangeAspect="1"/>
+            </wp:cNvGraphicFramePr>
+            <a:graphic>
+              <a:graphicData uri="http://schemas.openxmlformats.org/drawingml/2006/picture">
+                <pic:pic>
+                  <pic:nvPicPr>
+                    <pic:cNvPr id="0" name="diag_overall_arch.png"/>
+                    <pic:cNvPicPr/>
+                  </pic:nvPicPr>
+                  <pic:blipFill>
+                    <a:blip r:embed="rId11"/>
+                    <a:stretch>
+                      <a:fillRect/>
+                    </a:stretch>
+                  </pic:blipFill>
+                  <pic:spPr>
+                    <a:xfrm>
+                      <a:off x="0" y="0"/>
+                      <a:ext cx="5486400" cy="2873829"/>
+                    </a:xfrm>
+                    <a:prstGeom prst="rect"/>
+                  </pic:spPr>
+                </pic:pic>
+              </a:graphicData>
+            </a:graphic>
+          </wp:inline>
+        </w:drawing>
+      </w:r>
+    </w:p>
+    <w:p>
+      <w:pPr>
+        <w:spacing w:before="80" w:after="240"/>
+        <w:jc w:val="center"/>
+      </w:pPr>
+      <w:r>
+        <w:rPr>
+          <w:rFonts w:ascii="Times New Roman" w:hAnsi="Times New Roman"/>
+          <w:b/>
+          <w:i/>
+          <w:sz w:val="20"/>
+        </w:rPr>
+        <w:t>Figure 4.1: Overall 3-Tier System Architecture Diagram</w:t>
+      </w:r>
+    </w:p>
+    <w:p>
+      <w:pPr>
+        <w:spacing w:before="0" w:after="120" w:line="360" w:lineRule="auto"/>
+        <w:jc w:val="both"/>
+      </w:pPr>
+      <w:r>
+        <w:rPr>
+          <w:rFonts w:ascii="Times New Roman" w:hAnsi="Times New Roman"/>
+          <w:i/>
+          <w:sz w:val="24"/>
+        </w:rPr>
+        <w:t>Figure 4.1 illustrates the three distinct layers of the system, showcasing the decoupling of the client web-canvas from the Java Servlet application backend and spatial database. Each layer communicates over standardized TCP network ports.</w:t>
+      </w:r>
+    </w:p>
+    <w:p>
+      <w:pPr>
         <w:pStyle w:val="Heading2"/>
         <w:keepNext/>
         <w:spacing w:before="240" w:after="120"/>
@@ -4171,6 +4239,11 @@
       </w:r>
     </w:p>
     <w:p>
+      <w:r>
+        <w:br w:type="page"/>
+      </w:r>
+    </w:p>
+    <w:p>
       <w:pPr>
         <w:jc w:val="center"/>
       </w:pPr>
@@ -4178,7 +4251,7 @@
         <w:drawing>
           <wp:inline xmlns:a="http://schemas.openxmlformats.org/drawingml/2006/main" xmlns:pic="http://schemas.openxmlformats.org/drawingml/2006/picture">
             <wp:extent cx="5486400" cy="6839279"/>
-            <wp:docPr id="1" name="Picture 1"/>
+            <wp:docPr id="2" name="Picture 2"/>
             <wp:cNvGraphicFramePr>
               <a:graphicFrameLocks noChangeAspect="1"/>
             </wp:cNvGraphicFramePr>
@@ -4190,7 +4263,7 @@
                     <pic:cNvPicPr/>
                   </pic:nvPicPr>
                   <pic:blipFill>
-                    <a:blip r:embed="rId11"/>
+                    <a:blip r:embed="rId12"/>
                     <a:stretch>
                       <a:fillRect/>
                     </a:stretch>
@@ -4221,7 +4294,21 @@
           <w:i/>
           <w:sz w:val="20"/>
         </w:rPr>
-        <w:t>Figure 4.1: Entity Relationship Diagram (ERD) of Defence GIS database</w:t>
+        <w:t>Figure 4.6: Entity Relationship Diagram (ERD) of Defence GIS database</w:t>
+      </w:r>
+    </w:p>
+    <w:p>
+      <w:pPr>
+        <w:spacing w:before="0" w:after="120" w:line="360" w:lineRule="auto"/>
+        <w:jc w:val="both"/>
+      </w:pPr>
+      <w:r>
+        <w:rPr>
+          <w:rFonts w:ascii="Times New Roman" w:hAnsi="Times New Roman"/>
+          <w:i/>
+          <w:sz w:val="24"/>
+        </w:rPr>
+        <w:t>Figure 4.6 provides a complete database data-dictionary schema mapping all primary key, foreign key linkages, data types, and index locations.</w:t>
       </w:r>
     </w:p>
     <w:p>
@@ -4345,6 +4432,142 @@
     </w:p>
     <w:p>
       <w:pPr>
+        <w:jc w:val="center"/>
+      </w:pPr>
+      <w:r>
+        <w:drawing>
+          <wp:inline xmlns:a="http://schemas.openxmlformats.org/drawingml/2006/main" xmlns:pic="http://schemas.openxmlformats.org/drawingml/2006/picture">
+            <wp:extent cx="5029200" cy="2933700"/>
+            <wp:docPr id="3" name="Picture 3"/>
+            <wp:cNvGraphicFramePr>
+              <a:graphicFrameLocks noChangeAspect="1"/>
+            </wp:cNvGraphicFramePr>
+            <a:graphic>
+              <a:graphicData uri="http://schemas.openxmlformats.org/drawingml/2006/picture">
+                <pic:pic>
+                  <pic:nvPicPr>
+                    <pic:cNvPr id="0" name="diag_workflow.png"/>
+                    <pic:cNvPicPr/>
+                  </pic:nvPicPr>
+                  <pic:blipFill>
+                    <a:blip r:embed="rId13"/>
+                    <a:stretch>
+                      <a:fillRect/>
+                    </a:stretch>
+                  </pic:blipFill>
+                  <pic:spPr>
+                    <a:xfrm>
+                      <a:off x="0" y="0"/>
+                      <a:ext cx="5029200" cy="2933700"/>
+                    </a:xfrm>
+                    <a:prstGeom prst="rect"/>
+                  </pic:spPr>
+                </pic:pic>
+              </a:graphicData>
+            </a:graphic>
+          </wp:inline>
+        </w:drawing>
+      </w:r>
+    </w:p>
+    <w:p>
+      <w:pPr>
+        <w:spacing w:before="80" w:after="240"/>
+        <w:jc w:val="center"/>
+      </w:pPr>
+      <w:r>
+        <w:rPr>
+          <w:rFonts w:ascii="Times New Roman" w:hAnsi="Times New Roman"/>
+          <w:b/>
+          <w:i/>
+          <w:sz w:val="20"/>
+        </w:rPr>
+        <w:t>Figure 4.3: Telemetry Ingestion, Spatial Analysis, and Alerts Workflow Diagram</w:t>
+      </w:r>
+    </w:p>
+    <w:p>
+      <w:pPr>
+        <w:spacing w:before="0" w:after="120" w:line="360" w:lineRule="auto"/>
+        <w:jc w:val="both"/>
+      </w:pPr>
+      <w:r>
+        <w:rPr>
+          <w:rFonts w:ascii="Times New Roman" w:hAnsi="Times New Roman"/>
+          <w:i/>
+          <w:sz w:val="24"/>
+        </w:rPr>
+        <w:t>Figure 4.3 outlines the structural logical steps from coordinates telemetry ingress to geofence containment checks and alarms dispatch.</w:t>
+      </w:r>
+    </w:p>
+    <w:p>
+      <w:pPr>
+        <w:jc w:val="center"/>
+      </w:pPr>
+      <w:r>
+        <w:drawing>
+          <wp:inline xmlns:a="http://schemas.openxmlformats.org/drawingml/2006/main" xmlns:pic="http://schemas.openxmlformats.org/drawingml/2006/picture">
+            <wp:extent cx="5029200" cy="2933700"/>
+            <wp:docPr id="4" name="Picture 4"/>
+            <wp:cNvGraphicFramePr>
+              <a:graphicFrameLocks noChangeAspect="1"/>
+            </wp:cNvGraphicFramePr>
+            <a:graphic>
+              <a:graphicData uri="http://schemas.openxmlformats.org/drawingml/2006/picture">
+                <pic:pic>
+                  <pic:nvPicPr>
+                    <pic:cNvPr id="0" name="diag_sequence.png"/>
+                    <pic:cNvPicPr/>
+                  </pic:nvPicPr>
+                  <pic:blipFill>
+                    <a:blip r:embed="rId14"/>
+                    <a:stretch>
+                      <a:fillRect/>
+                    </a:stretch>
+                  </pic:blipFill>
+                  <pic:spPr>
+                    <a:xfrm>
+                      <a:off x="0" y="0"/>
+                      <a:ext cx="5029200" cy="2933700"/>
+                    </a:xfrm>
+                    <a:prstGeom prst="rect"/>
+                  </pic:spPr>
+                </pic:pic>
+              </a:graphicData>
+            </a:graphic>
+          </wp:inline>
+        </w:drawing>
+      </w:r>
+    </w:p>
+    <w:p>
+      <w:pPr>
+        <w:spacing w:before="80" w:after="240"/>
+        <w:jc w:val="center"/>
+      </w:pPr>
+      <w:r>
+        <w:rPr>
+          <w:rFonts w:ascii="Times New Roman" w:hAnsi="Times New Roman"/>
+          <w:b/>
+          <w:i/>
+          <w:sz w:val="20"/>
+        </w:rPr>
+        <w:t>Figure 4.4: Ingestion &amp; Breach Detection Sequence Diagram</w:t>
+      </w:r>
+    </w:p>
+    <w:p>
+      <w:pPr>
+        <w:spacing w:before="0" w:after="120" w:line="360" w:lineRule="auto"/>
+        <w:jc w:val="both"/>
+      </w:pPr>
+      <w:r>
+        <w:rPr>
+          <w:rFonts w:ascii="Times New Roman" w:hAnsi="Times New Roman"/>
+          <w:i/>
+          <w:sz w:val="24"/>
+        </w:rPr>
+        <w:t>Figure 4.4 shows the timeline call sequences between the external asset transceiver, servlet container, database trigger, and frontend GUI panel.</w:t>
+      </w:r>
+    </w:p>
+    <w:p>
+      <w:pPr>
         <w:pStyle w:val="Heading2"/>
         <w:keepNext/>
         <w:spacing w:before="240" w:after="120"/>
@@ -4370,6 +4593,142 @@
           <w:sz w:val="24"/>
         </w:rPr>
         <w:t>The system deployment decouples containers, persistent volumes, and custom setups. In this 3-tier container stack, the main tomcat container serves the application on host port 8080, postgres handles raw SQL operations on port 5432, and geoserver handles vector map rendering on port 8085. A private bridge network (defence-net) isolates database and mapping links, ensuring high security and modularity.</w:t>
+      </w:r>
+    </w:p>
+    <w:p>
+      <w:pPr>
+        <w:jc w:val="center"/>
+      </w:pPr>
+      <w:r>
+        <w:drawing>
+          <wp:inline xmlns:a="http://schemas.openxmlformats.org/drawingml/2006/main" xmlns:pic="http://schemas.openxmlformats.org/drawingml/2006/picture">
+            <wp:extent cx="5486400" cy="2873829"/>
+            <wp:docPr id="5" name="Picture 5"/>
+            <wp:cNvGraphicFramePr>
+              <a:graphicFrameLocks noChangeAspect="1"/>
+            </wp:cNvGraphicFramePr>
+            <a:graphic>
+              <a:graphicData uri="http://schemas.openxmlformats.org/drawingml/2006/picture">
+                <pic:pic>
+                  <pic:nvPicPr>
+                    <pic:cNvPr id="0" name="diag_docker_arch.png"/>
+                    <pic:cNvPicPr/>
+                  </pic:nvPicPr>
+                  <pic:blipFill>
+                    <a:blip r:embed="rId15"/>
+                    <a:stretch>
+                      <a:fillRect/>
+                    </a:stretch>
+                  </pic:blipFill>
+                  <pic:spPr>
+                    <a:xfrm>
+                      <a:off x="0" y="0"/>
+                      <a:ext cx="5486400" cy="2873829"/>
+                    </a:xfrm>
+                    <a:prstGeom prst="rect"/>
+                  </pic:spPr>
+                </pic:pic>
+              </a:graphicData>
+            </a:graphic>
+          </wp:inline>
+        </w:drawing>
+      </w:r>
+    </w:p>
+    <w:p>
+      <w:pPr>
+        <w:spacing w:before="80" w:after="240"/>
+        <w:jc w:val="center"/>
+      </w:pPr>
+      <w:r>
+        <w:rPr>
+          <w:rFonts w:ascii="Times New Roman" w:hAnsi="Times New Roman"/>
+          <w:b/>
+          <w:i/>
+          <w:sz w:val="20"/>
+        </w:rPr>
+        <w:t>Figure 4.2: Dockerized Multi-Container Network &amp; Volumes Topology Diagram</w:t>
+      </w:r>
+    </w:p>
+    <w:p>
+      <w:pPr>
+        <w:spacing w:before="0" w:after="120" w:line="360" w:lineRule="auto"/>
+        <w:jc w:val="both"/>
+      </w:pPr>
+      <w:r>
+        <w:rPr>
+          <w:rFonts w:ascii="Times New Roman" w:hAnsi="Times New Roman"/>
+          <w:i/>
+          <w:sz w:val="24"/>
+        </w:rPr>
+        <w:t>Figure 4.2 highlights container mappings inside the private bridge network, indicating volume data storage and mapping setups sidecar ports.</w:t>
+      </w:r>
+    </w:p>
+    <w:p>
+      <w:pPr>
+        <w:jc w:val="center"/>
+      </w:pPr>
+      <w:r>
+        <w:drawing>
+          <wp:inline xmlns:a="http://schemas.openxmlformats.org/drawingml/2006/main" xmlns:pic="http://schemas.openxmlformats.org/drawingml/2006/picture">
+            <wp:extent cx="5486400" cy="2873829"/>
+            <wp:docPr id="6" name="Picture 6"/>
+            <wp:cNvGraphicFramePr>
+              <a:graphicFrameLocks noChangeAspect="1"/>
+            </wp:cNvGraphicFramePr>
+            <a:graphic>
+              <a:graphicData uri="http://schemas.openxmlformats.org/drawingml/2006/picture">
+                <pic:pic>
+                  <pic:nvPicPr>
+                    <pic:cNvPr id="0" name="diag_deployment.png"/>
+                    <pic:cNvPicPr/>
+                  </pic:nvPicPr>
+                  <pic:blipFill>
+                    <a:blip r:embed="rId16"/>
+                    <a:stretch>
+                      <a:fillRect/>
+                    </a:stretch>
+                  </pic:blipFill>
+                  <pic:spPr>
+                    <a:xfrm>
+                      <a:off x="0" y="0"/>
+                      <a:ext cx="5486400" cy="2873829"/>
+                    </a:xfrm>
+                    <a:prstGeom prst="rect"/>
+                  </pic:spPr>
+                </pic:pic>
+              </a:graphicData>
+            </a:graphic>
+          </wp:inline>
+        </w:drawing>
+      </w:r>
+    </w:p>
+    <w:p>
+      <w:pPr>
+        <w:spacing w:before="80" w:after="240"/>
+        <w:jc w:val="center"/>
+      </w:pPr>
+      <w:r>
+        <w:rPr>
+          <w:rFonts w:ascii="Times New Roman" w:hAnsi="Times New Roman"/>
+          <w:b/>
+          <w:i/>
+          <w:sz w:val="20"/>
+        </w:rPr>
+        <w:t>Figure 4.5: Enterprise Deployment Topology with Port Mappings</w:t>
+      </w:r>
+    </w:p>
+    <w:p>
+      <w:pPr>
+        <w:spacing w:before="0" w:after="120" w:line="360" w:lineRule="auto"/>
+        <w:jc w:val="both"/>
+      </w:pPr>
+      <w:r>
+        <w:rPr>
+          <w:rFonts w:ascii="Times New Roman" w:hAnsi="Times New Roman"/>
+          <w:i/>
+          <w:sz w:val="24"/>
+        </w:rPr>
+        <w:t>Figure 4.5 describes server execution environments mapping host virtual ports to individual containers.</w:t>
       </w:r>
     </w:p>
     <w:p>
@@ -5379,8 +5738,144 @@
       <w:r>
         <w:drawing>
           <wp:inline xmlns:a="http://schemas.openxmlformats.org/drawingml/2006/main" xmlns:pic="http://schemas.openxmlformats.org/drawingml/2006/picture">
+            <wp:extent cx="4572000" cy="3362107"/>
+            <wp:docPr id="7" name="Picture 7"/>
+            <wp:cNvGraphicFramePr>
+              <a:graphicFrameLocks noChangeAspect="1"/>
+            </wp:cNvGraphicFramePr>
+            <a:graphic>
+              <a:graphicData uri="http://schemas.openxmlformats.org/drawingml/2006/picture">
+                <pic:pic>
+                  <pic:nvPicPr>
+                    <pic:cNvPr id="0" name="geoserver_welcome.png"/>
+                    <pic:cNvPicPr/>
+                  </pic:nvPicPr>
+                  <pic:blipFill>
+                    <a:blip r:embed="rId17"/>
+                    <a:stretch>
+                      <a:fillRect/>
+                    </a:stretch>
+                  </pic:blipFill>
+                  <pic:spPr>
+                    <a:xfrm>
+                      <a:off x="0" y="0"/>
+                      <a:ext cx="4572000" cy="3362107"/>
+                    </a:xfrm>
+                    <a:prstGeom prst="rect"/>
+                  </pic:spPr>
+                </pic:pic>
+              </a:graphicData>
+            </a:graphic>
+          </wp:inline>
+        </w:drawing>
+      </w:r>
+    </w:p>
+    <w:p>
+      <w:pPr>
+        <w:spacing w:before="80" w:after="240"/>
+        <w:jc w:val="center"/>
+      </w:pPr>
+      <w:r>
+        <w:rPr>
+          <w:rFonts w:ascii="Times New Roman" w:hAnsi="Times New Roman"/>
+          <w:b/>
+          <w:i/>
+          <w:sz w:val="20"/>
+        </w:rPr>
+        <w:t>Figure 10.1: GeoServer Administration Panel - Welcome Page of GeoServer spatial application</w:t>
+      </w:r>
+    </w:p>
+    <w:p>
+      <w:pPr>
+        <w:spacing w:before="0" w:after="120" w:line="360" w:lineRule="auto"/>
+        <w:jc w:val="both"/>
+      </w:pPr>
+      <w:r>
+        <w:rPr>
+          <w:rFonts w:ascii="Times New Roman" w:hAnsi="Times New Roman"/>
+          <w:i/>
+          <w:sz w:val="24"/>
+        </w:rPr>
+        <w:t>Figure 10.1 shows the web administration console of the GeoServer service running on host port 8085. The dashboard enables administrators to verify the system status, check memory allocations, and configure workspace namespaces.</w:t>
+      </w:r>
+    </w:p>
+    <w:p>
+      <w:pPr>
+        <w:jc w:val="center"/>
+      </w:pPr>
+      <w:r>
+        <w:drawing>
+          <wp:inline xmlns:a="http://schemas.openxmlformats.org/drawingml/2006/main" xmlns:pic="http://schemas.openxmlformats.org/drawingml/2006/picture">
+            <wp:extent cx="4572000" cy="2090738"/>
+            <wp:docPr id="8" name="Picture 8"/>
+            <wp:cNvGraphicFramePr>
+              <a:graphicFrameLocks noChangeAspect="1"/>
+            </wp:cNvGraphicFramePr>
+            <a:graphic>
+              <a:graphicData uri="http://schemas.openxmlformats.org/drawingml/2006/picture">
+                <pic:pic>
+                  <pic:nvPicPr>
+                    <pic:cNvPr id="0" name="geoserver_layers.png"/>
+                    <pic:cNvPicPr/>
+                  </pic:nvPicPr>
+                  <pic:blipFill>
+                    <a:blip r:embed="rId18"/>
+                    <a:stretch>
+                      <a:fillRect/>
+                    </a:stretch>
+                  </pic:blipFill>
+                  <pic:spPr>
+                    <a:xfrm>
+                      <a:off x="0" y="0"/>
+                      <a:ext cx="4572000" cy="2090738"/>
+                    </a:xfrm>
+                    <a:prstGeom prst="rect"/>
+                  </pic:spPr>
+                </pic:pic>
+              </a:graphicData>
+            </a:graphic>
+          </wp:inline>
+        </w:drawing>
+      </w:r>
+    </w:p>
+    <w:p>
+      <w:pPr>
+        <w:spacing w:before="80" w:after="240"/>
+        <w:jc w:val="center"/>
+      </w:pPr>
+      <w:r>
+        <w:rPr>
+          <w:rFonts w:ascii="Times New Roman" w:hAnsi="Times New Roman"/>
+          <w:b/>
+          <w:i/>
+          <w:sz w:val="20"/>
+        </w:rPr>
+        <w:t>Figure 10.2: GeoServer Layer Publications List - Published Vector Map Layers in GeoServer Web Admin</w:t>
+      </w:r>
+    </w:p>
+    <w:p>
+      <w:pPr>
+        <w:spacing w:before="0" w:after="120" w:line="360" w:lineRule="auto"/>
+        <w:jc w:val="both"/>
+      </w:pPr>
+      <w:r>
+        <w:rPr>
+          <w:rFonts w:ascii="Times New Roman" w:hAnsi="Times New Roman"/>
+          <w:i/>
+          <w:sz w:val="24"/>
+        </w:rPr>
+        <w:t>Figure 10.2 shows the list of registered spatial layers including defence:asset_positions, defence:geofence_zones, and defence:track_history. These are bound to the PostGIS datastore and served using OGC standards.</w:t>
+      </w:r>
+    </w:p>
+    <w:p>
+      <w:pPr>
+        <w:jc w:val="center"/>
+      </w:pPr>
+      <w:r>
+        <w:drawing>
+          <wp:inline xmlns:a="http://schemas.openxmlformats.org/drawingml/2006/main" xmlns:pic="http://schemas.openxmlformats.org/drawingml/2006/picture">
             <wp:extent cx="4572000" cy="2462525"/>
-            <wp:docPr id="2" name="Picture 2"/>
+            <wp:docPr id="9" name="Picture 9"/>
             <wp:cNvGraphicFramePr>
               <a:graphicFrameLocks noChangeAspect="1"/>
             </wp:cNvGraphicFramePr>
@@ -5392,7 +5887,7 @@
                     <pic:cNvPicPr/>
                   </pic:nvPicPr>
                   <pic:blipFill>
-                    <a:blip r:embed="rId12"/>
+                    <a:blip r:embed="rId19"/>
                     <a:stretch>
                       <a:fillRect/>
                     </a:stretch>
@@ -5423,7 +5918,21 @@
           <w:i/>
           <w:sz w:val="20"/>
         </w:rPr>
-        <w:t>Figure 10.1: Landing Page -  COMMAND Tactical Portal Welcome Page</w:t>
+        <w:t>Figure 10.3: Tactical Portal Welcome Page - Welcome Landing Interface</w:t>
+      </w:r>
+    </w:p>
+    <w:p>
+      <w:pPr>
+        <w:spacing w:before="0" w:after="120" w:line="360" w:lineRule="auto"/>
+        <w:jc w:val="both"/>
+      </w:pPr>
+      <w:r>
+        <w:rPr>
+          <w:rFonts w:ascii="Times New Roman" w:hAnsi="Times New Roman"/>
+          <w:i/>
+          <w:sz w:val="24"/>
+        </w:rPr>
+        <w:t>Figure 10.3 presents the dark-themed tactical portal landing page. It showcases system stats, active users counts, and link paths to the main login portal.</w:t>
       </w:r>
     </w:p>
     <w:p>
@@ -5434,7 +5943,7 @@
         <w:drawing>
           <wp:inline xmlns:a="http://schemas.openxmlformats.org/drawingml/2006/main" xmlns:pic="http://schemas.openxmlformats.org/drawingml/2006/picture">
             <wp:extent cx="4572000" cy="2462525"/>
-            <wp:docPr id="3" name="Picture 3"/>
+            <wp:docPr id="10" name="Picture 10"/>
             <wp:cNvGraphicFramePr>
               <a:graphicFrameLocks noChangeAspect="1"/>
             </wp:cNvGraphicFramePr>
@@ -5446,7 +5955,7 @@
                     <pic:cNvPicPr/>
                   </pic:nvPicPr>
                   <pic:blipFill>
-                    <a:blip r:embed="rId13"/>
+                    <a:blip r:embed="rId20"/>
                     <a:stretch>
                       <a:fillRect/>
                     </a:stretch>
@@ -5477,7 +5986,21 @@
           <w:i/>
           <w:sz w:val="20"/>
         </w:rPr>
-        <w:t>Figure 10.2: Login Page -  Secure Portal Authentication Panel</w:t>
+        <w:t>Figure 10.4: Secure Portal Authentication Panel - Portal Authentication and BCrypt Verification Page</w:t>
+      </w:r>
+    </w:p>
+    <w:p>
+      <w:pPr>
+        <w:spacing w:before="0" w:after="120" w:line="360" w:lineRule="auto"/>
+        <w:jc w:val="both"/>
+      </w:pPr>
+      <w:r>
+        <w:rPr>
+          <w:rFonts w:ascii="Times New Roman" w:hAnsi="Times New Roman"/>
+          <w:i/>
+          <w:sz w:val="24"/>
+        </w:rPr>
+        <w:t>Figure 10.4 shows the secure portal login page, enforcing BCrypt authentication filters and guarding user sessions before exposing operational views.</w:t>
       </w:r>
     </w:p>
     <w:p>
@@ -5488,7 +6011,7 @@
         <w:drawing>
           <wp:inline xmlns:a="http://schemas.openxmlformats.org/drawingml/2006/main" xmlns:pic="http://schemas.openxmlformats.org/drawingml/2006/picture">
             <wp:extent cx="4572000" cy="2462525"/>
-            <wp:docPr id="4" name="Picture 4"/>
+            <wp:docPr id="11" name="Picture 11"/>
             <wp:cNvGraphicFramePr>
               <a:graphicFrameLocks noChangeAspect="1"/>
             </wp:cNvGraphicFramePr>
@@ -5500,7 +6023,7 @@
                     <pic:cNvPicPr/>
                   </pic:nvPicPr>
                   <pic:blipFill>
-                    <a:blip r:embed="rId14"/>
+                    <a:blip r:embed="rId21"/>
                     <a:stretch>
                       <a:fillRect/>
                     </a:stretch>
@@ -5531,7 +6054,21 @@
           <w:i/>
           <w:sz w:val="20"/>
         </w:rPr>
-        <w:t>Figure 10.3: Dashboard Metrics -  Real-Time Assets &amp; Alerts Metrics Statistics</w:t>
+        <w:t>Figure 10.5: Operational Dashboard Statistics - Real-Time Fleet &amp; perimeter Alerts KPI Metrics Panel</w:t>
+      </w:r>
+    </w:p>
+    <w:p>
+      <w:pPr>
+        <w:spacing w:before="0" w:after="120" w:line="360" w:lineRule="auto"/>
+        <w:jc w:val="both"/>
+      </w:pPr>
+      <w:r>
+        <w:rPr>
+          <w:rFonts w:ascii="Times New Roman" w:hAnsi="Times New Roman"/>
+          <w:i/>
+          <w:sz w:val="24"/>
+        </w:rPr>
+        <w:t>Figure 10.5 highlights the real-time operational dashboard compiling active combat units, geofenced boundaries, and unacknowledged breach alerts.</w:t>
       </w:r>
     </w:p>
     <w:p>
@@ -5542,7 +6079,7 @@
         <w:drawing>
           <wp:inline xmlns:a="http://schemas.openxmlformats.org/drawingml/2006/main" xmlns:pic="http://schemas.openxmlformats.org/drawingml/2006/picture">
             <wp:extent cx="4572000" cy="2462525"/>
-            <wp:docPr id="5" name="Picture 5"/>
+            <wp:docPr id="12" name="Picture 12"/>
             <wp:cNvGraphicFramePr>
               <a:graphicFrameLocks noChangeAspect="1"/>
             </wp:cNvGraphicFramePr>
@@ -5554,7 +6091,7 @@
                     <pic:cNvPicPr/>
                   </pic:nvPicPr>
                   <pic:blipFill>
-                    <a:blip r:embed="rId15"/>
+                    <a:blip r:embed="rId22"/>
                     <a:stretch>
                       <a:fillRect/>
                     </a:stretch>
@@ -5585,7 +6122,21 @@
           <w:i/>
           <w:sz w:val="20"/>
         </w:rPr>
-        <w:t>Figure 10.4: Live Tracking Map -  Real-Time Telemetry Map Tracker Overlay</w:t>
+        <w:t>Figure 10.6: Live Mapping Tracking Interface - Real-Time Map Tracker Overlay</w:t>
+      </w:r>
+    </w:p>
+    <w:p>
+      <w:pPr>
+        <w:spacing w:before="0" w:after="120" w:line="360" w:lineRule="auto"/>
+        <w:jc w:val="both"/>
+      </w:pPr>
+      <w:r>
+        <w:rPr>
+          <w:rFonts w:ascii="Times New Roman" w:hAnsi="Times New Roman"/>
+          <w:i/>
+          <w:sz w:val="24"/>
+        </w:rPr>
+        <w:t>Figure 10.6 showcases the interactive Leaflet mapping dashboard displaying live telemetry coordinates and active tracks overlay.</w:t>
       </w:r>
     </w:p>
     <w:p>
@@ -5596,7 +6147,7 @@
         <w:drawing>
           <wp:inline xmlns:a="http://schemas.openxmlformats.org/drawingml/2006/main" xmlns:pic="http://schemas.openxmlformats.org/drawingml/2006/picture">
             <wp:extent cx="4572000" cy="2462525"/>
-            <wp:docPr id="6" name="Picture 6"/>
+            <wp:docPr id="13" name="Picture 13"/>
             <wp:cNvGraphicFramePr>
               <a:graphicFrameLocks noChangeAspect="1"/>
             </wp:cNvGraphicFramePr>
@@ -5608,7 +6159,7 @@
                     <pic:cNvPicPr/>
                   </pic:nvPicPr>
                   <pic:blipFill>
-                    <a:blip r:embed="rId16"/>
+                    <a:blip r:embed="rId23"/>
                     <a:stretch>
                       <a:fillRect/>
                     </a:stretch>
@@ -5639,7 +6190,21 @@
           <w:i/>
           <w:sz w:val="20"/>
         </w:rPr>
-        <w:t>Figure 10.5: Geofence Zones Map -  Perimeter Geofencing Restricted &amp; Safe Zones</w:t>
+        <w:t>Figure 10.7: Perimeter Geofencing restricted boundaries - Perimeter Geofencing Restricted &amp; Warning Zones Map</w:t>
+      </w:r>
+    </w:p>
+    <w:p>
+      <w:pPr>
+        <w:spacing w:before="0" w:after="120" w:line="360" w:lineRule="auto"/>
+        <w:jc w:val="both"/>
+      </w:pPr>
+      <w:r>
+        <w:rPr>
+          <w:rFonts w:ascii="Times New Roman" w:hAnsi="Times New Roman"/>
+          <w:i/>
+          <w:sz w:val="24"/>
+        </w:rPr>
+        <w:t>Figure 10.7 illustrates the geofencing layer displaying restricted sectors (red polygons) and warning perimeter boundaries (orange polygons).</w:t>
       </w:r>
     </w:p>
     <w:p>
@@ -5650,7 +6215,7 @@
         <w:drawing>
           <wp:inline xmlns:a="http://schemas.openxmlformats.org/drawingml/2006/main" xmlns:pic="http://schemas.openxmlformats.org/drawingml/2006/picture">
             <wp:extent cx="4572000" cy="2462525"/>
-            <wp:docPr id="7" name="Picture 7"/>
+            <wp:docPr id="14" name="Picture 14"/>
             <wp:cNvGraphicFramePr>
               <a:graphicFrameLocks noChangeAspect="1"/>
             </wp:cNvGraphicFramePr>
@@ -5662,7 +6227,7 @@
                     <pic:cNvPicPr/>
                   </pic:nvPicPr>
                   <pic:blipFill>
-                    <a:blip r:embed="rId17"/>
+                    <a:blip r:embed="rId24"/>
                     <a:stretch>
                       <a:fillRect/>
                     </a:stretch>
@@ -5693,7 +6258,89 @@
           <w:i/>
           <w:sz w:val="20"/>
         </w:rPr>
-        <w:t>Figure 10.6: Alarms Feed Table -  Breach Detection Alarms Logs Registry</w:t>
+        <w:t>Figure 10.8: Breach Alarm Event Log Grid - Breach Detection Alarms Logs Registry</w:t>
+      </w:r>
+    </w:p>
+    <w:p>
+      <w:pPr>
+        <w:spacing w:before="0" w:after="120" w:line="360" w:lineRule="auto"/>
+        <w:jc w:val="both"/>
+      </w:pPr>
+      <w:r>
+        <w:rPr>
+          <w:rFonts w:ascii="Times New Roman" w:hAnsi="Times New Roman"/>
+          <w:i/>
+          <w:sz w:val="24"/>
+        </w:rPr>
+        <w:t>Figure 10.8 presents the active alerts grid, recording violating assets, breached zones, entry/exit timestamp, and operator actions.</w:t>
+      </w:r>
+    </w:p>
+    <w:p>
+      <w:pPr>
+        <w:jc w:val="center"/>
+      </w:pPr>
+      <w:r>
+        <w:drawing>
+          <wp:inline xmlns:a="http://schemas.openxmlformats.org/drawingml/2006/main" xmlns:pic="http://schemas.openxmlformats.org/drawingml/2006/picture">
+            <wp:extent cx="4572000" cy="2462525"/>
+            <wp:docPr id="15" name="Picture 15"/>
+            <wp:cNvGraphicFramePr>
+              <a:graphicFrameLocks noChangeAspect="1"/>
+            </wp:cNvGraphicFramePr>
+            <a:graphic>
+              <a:graphicData uri="http://schemas.openxmlformats.org/drawingml/2006/picture">
+                <pic:pic>
+                  <pic:nvPicPr>
+                    <pic:cNvPr id="0" name="reports.png"/>
+                    <pic:cNvPicPr/>
+                  </pic:nvPicPr>
+                  <pic:blipFill>
+                    <a:blip r:embed="rId25"/>
+                    <a:stretch>
+                      <a:fillRect/>
+                    </a:stretch>
+                  </pic:blipFill>
+                  <pic:spPr>
+                    <a:xfrm>
+                      <a:off x="0" y="0"/>
+                      <a:ext cx="4572000" cy="2462525"/>
+                    </a:xfrm>
+                    <a:prstGeom prst="rect"/>
+                  </pic:spPr>
+                </pic:pic>
+              </a:graphicData>
+            </a:graphic>
+          </wp:inline>
+        </w:drawing>
+      </w:r>
+    </w:p>
+    <w:p>
+      <w:pPr>
+        <w:spacing w:before="80" w:after="240"/>
+        <w:jc w:val="center"/>
+      </w:pPr>
+      <w:r>
+        <w:rPr>
+          <w:rFonts w:ascii="Times New Roman" w:hAnsi="Times New Roman"/>
+          <w:b/>
+          <w:i/>
+          <w:sz w:val="20"/>
+        </w:rPr>
+        <w:t>Figure 10.9: Analytical Report Compilation Interface - Analytical Reports and Coordinates Query Page</w:t>
+      </w:r>
+    </w:p>
+    <w:p>
+      <w:pPr>
+        <w:spacing w:before="0" w:after="120" w:line="360" w:lineRule="auto"/>
+        <w:jc w:val="both"/>
+      </w:pPr>
+      <w:r>
+        <w:rPr>
+          <w:rFonts w:ascii="Times New Roman" w:hAnsi="Times New Roman"/>
+          <w:i/>
+          <w:sz w:val="24"/>
+        </w:rPr>
+        <w:t>Figure 10.9 highlights the report compile workspace, allowing operators to filter history track coordinates and export session audits.</w:t>
       </w:r>
     </w:p>
     <w:p>

</xml_diff>

<commit_message>
Upgrade DRDO Internship Report to publication-quality v2, rendering 9 vector-quality diagrams, expanding DLJ divisions and detailed testing matrices
</commit_message>
<xml_diff>
--- a/DRDO_Internship_Report.docx
+++ b/DRDO_Internship_Report.docx
@@ -272,7 +272,7 @@
           <w:rFonts w:ascii="Times New Roman" w:hAnsi="Times New Roman"/>
           <w:b/>
           <w:color w:val="000000"/>
-          <w:sz w:val="32"/>
+          <w:sz w:val="28"/>
         </w:rPr>
         <w:t>DEFENCE LABORATORY JODHPUR (DLJ)</w:t>
       </w:r>
@@ -362,7 +362,7 @@
           <w:rFonts w:ascii="Times New Roman" w:hAnsi="Times New Roman"/>
           <w:b/>
           <w:color w:val="000000"/>
-          <w:sz w:val="32"/>
+          <w:sz w:val="28"/>
         </w:rPr>
         <w:t>DECLARATION BY STUDENTS</w:t>
       </w:r>
@@ -554,7 +554,7 @@
           <w:rFonts w:ascii="Times New Roman" w:hAnsi="Times New Roman"/>
           <w:b/>
           <w:color w:val="000000"/>
-          <w:sz w:val="32"/>
+          <w:sz w:val="28"/>
         </w:rPr>
         <w:t>ACKNOWLEDGEMENT</w:t>
       </w:r>
@@ -633,7 +633,7 @@
           <w:rFonts w:ascii="Times New Roman" w:hAnsi="Times New Roman"/>
           <w:b/>
           <w:color w:val="000000"/>
-          <w:sz w:val="32"/>
+          <w:sz w:val="28"/>
         </w:rPr>
         <w:t>ABSTRACT</w:t>
       </w:r>
@@ -682,7 +682,7 @@
           <w:rFonts w:ascii="Times New Roman" w:hAnsi="Times New Roman"/>
           <w:b/>
           <w:color w:val="000000"/>
-          <w:sz w:val="32"/>
+          <w:sz w:val="28"/>
         </w:rPr>
         <w:t>TABLE OF CONTENTS</w:t>
       </w:r>
@@ -850,7 +850,7 @@
           <w:rFonts w:ascii="Times New Roman" w:hAnsi="Times New Roman"/>
           <w:sz w:val="22"/>
         </w:rPr>
-        <w:t xml:space="preserve">   1.2 Internship Overview</w:t>
+        <w:t xml:space="preserve">   1.2 DLJ Technical Divisions &amp; Camouflage</w:t>
       </w:r>
       <w:r>
         <w:tab/>
@@ -869,7 +869,7 @@
           <w:rFonts w:ascii="Times New Roman" w:hAnsi="Times New Roman"/>
           <w:sz w:val="22"/>
         </w:rPr>
-        <w:t xml:space="preserve">   1.3 Problem Statement</w:t>
+        <w:t xml:space="preserve">   1.3 Internship Scope Overview</w:t>
       </w:r>
       <w:r>
         <w:tab/>
@@ -888,7 +888,7 @@
           <w:rFonts w:ascii="Times New Roman" w:hAnsi="Times New Roman"/>
           <w:sz w:val="22"/>
         </w:rPr>
-        <w:t xml:space="preserve">   1.4 Proposed System Solution</w:t>
+        <w:t xml:space="preserve">   1.4 Technical Problem Statement</w:t>
       </w:r>
       <w:r>
         <w:tab/>
@@ -907,11 +907,30 @@
           <w:rFonts w:ascii="Times New Roman" w:hAnsi="Times New Roman"/>
           <w:sz w:val="22"/>
         </w:rPr>
-        <w:t xml:space="preserve">   1.5 Project Scope and Objectives</w:t>
+        <w:t xml:space="preserve">   1.5 Proposed Spatial Intelligence Solution</w:t>
       </w:r>
       <w:r>
         <w:tab/>
-        <w:t>6</w:t>
+        <w:t>5</w:t>
+      </w:r>
+    </w:p>
+    <w:p>
+      <w:pPr>
+        <w:tabs>
+          <w:tab w:pos="8640" w:val="right" w:leader="dot"/>
+        </w:tabs>
+        <w:spacing w:before="0" w:after="40" w:line="276" w:lineRule="auto"/>
+      </w:pPr>
+      <w:r>
+        <w:rPr>
+          <w:rFonts w:ascii="Times New Roman" w:hAnsi="Times New Roman"/>
+          <w:sz w:val="22"/>
+        </w:rPr>
+        <w:t xml:space="preserve">   1.6 Specific Project Objectives</w:t>
+      </w:r>
+      <w:r>
+        <w:tab/>
+        <w:t>7</w:t>
       </w:r>
     </w:p>
     <w:p>
@@ -931,7 +950,7 @@
       </w:r>
       <w:r>
         <w:tab/>
-        <w:t>8</w:t>
+        <w:t>9</w:t>
       </w:r>
     </w:p>
     <w:p>
@@ -946,11 +965,11 @@
           <w:rFonts w:ascii="Times New Roman" w:hAnsi="Times New Roman"/>
           <w:sz w:val="22"/>
         </w:rPr>
-        <w:t xml:space="preserve">   2.1 Geographic Information Systems (GIS)</w:t>
+        <w:t xml:space="preserve">   2.1 Geographic Information Systems (GIS) Evolution</w:t>
       </w:r>
       <w:r>
         <w:tab/>
-        <w:t>8</w:t>
+        <w:t>9</w:t>
       </w:r>
     </w:p>
     <w:p>
@@ -965,11 +984,11 @@
           <w:rFonts w:ascii="Times New Roman" w:hAnsi="Times New Roman"/>
           <w:sz w:val="22"/>
         </w:rPr>
-        <w:t xml:space="preserve">   2.2 OGC Mapping Web Services (WMS/WFS)</w:t>
+        <w:t xml:space="preserve">   2.2 OGC Specifications &amp; WMS/WFS Services</w:t>
       </w:r>
       <w:r>
         <w:tab/>
-        <w:t>9</w:t>
+        <w:t>11</w:t>
       </w:r>
     </w:p>
     <w:p>
@@ -984,11 +1003,11 @@
           <w:rFonts w:ascii="Times New Roman" w:hAnsi="Times New Roman"/>
           <w:sz w:val="22"/>
         </w:rPr>
-        <w:t xml:space="preserve">   2.3 Relational Spatial Databases &amp; PostGIS</w:t>
+        <w:t xml:space="preserve">   2.3 Spatial Databasing Mechanics: PostGIS</w:t>
       </w:r>
       <w:r>
         <w:tab/>
-        <w:t>11</w:t>
+        <w:t>13</w:t>
       </w:r>
     </w:p>
     <w:p>
@@ -1003,11 +1022,11 @@
           <w:rFonts w:ascii="Times New Roman" w:hAnsi="Times New Roman"/>
           <w:sz w:val="22"/>
         </w:rPr>
-        <w:t xml:space="preserve">   2.4 Geofencing Algorithms &amp; Topologies</w:t>
+        <w:t xml:space="preserve">   2.4 Geofencing containment: Ray-Casting Logic</w:t>
       </w:r>
       <w:r>
         <w:tab/>
-        <w:t>13</w:t>
+        <w:t>15</w:t>
       </w:r>
     </w:p>
     <w:p>
@@ -1027,7 +1046,7 @@
       </w:r>
       <w:r>
         <w:tab/>
-        <w:t>16</w:t>
+        <w:t>18</w:t>
       </w:r>
     </w:p>
     <w:p>
@@ -1042,11 +1061,11 @@
           <w:rFonts w:ascii="Times New Roman" w:hAnsi="Times New Roman"/>
           <w:sz w:val="22"/>
         </w:rPr>
-        <w:t xml:space="preserve">   3.1 Functional Requirements</w:t>
+        <w:t xml:space="preserve">   3.1 Detailed Functional Modules Specifications</w:t>
       </w:r>
       <w:r>
         <w:tab/>
-        <w:t>16</w:t>
+        <w:t>18</w:t>
       </w:r>
     </w:p>
     <w:p>
@@ -1061,11 +1080,11 @@
           <w:rFonts w:ascii="Times New Roman" w:hAnsi="Times New Roman"/>
           <w:sz w:val="22"/>
         </w:rPr>
-        <w:t xml:space="preserve">   3.2 Non-Functional Requirements</w:t>
+        <w:t xml:space="preserve">   3.2 Technical Non-Functional Standards</w:t>
       </w:r>
       <w:r>
         <w:tab/>
-        <w:t>18</w:t>
+        <w:t>20</w:t>
       </w:r>
     </w:p>
     <w:p>
@@ -1080,11 +1099,11 @@
           <w:rFonts w:ascii="Times New Roman" w:hAnsi="Times New Roman"/>
           <w:sz w:val="22"/>
         </w:rPr>
-        <w:t xml:space="preserve">   3.3 Hardware Specifications</w:t>
+        <w:t xml:space="preserve">   3.3 Target Hardware Resource Specifications</w:t>
       </w:r>
       <w:r>
         <w:tab/>
-        <w:t>19</w:t>
+        <w:t>22</w:t>
       </w:r>
     </w:p>
     <w:p>
@@ -1099,11 +1118,11 @@
           <w:rFonts w:ascii="Times New Roman" w:hAnsi="Times New Roman"/>
           <w:sz w:val="22"/>
         </w:rPr>
-        <w:t xml:space="preserve">   3.4 Software Runtime Environment</w:t>
+        <w:t xml:space="preserve">   3.4 Software Runtimes Configuration Matrix</w:t>
       </w:r>
       <w:r>
         <w:tab/>
-        <w:t>21</w:t>
+        <w:t>24</w:t>
       </w:r>
     </w:p>
     <w:p>
@@ -1119,11 +1138,11 @@
           <w:b/>
           <w:sz w:val="22"/>
         </w:rPr>
-        <w:t>Chapter 4: System Design</w:t>
+        <w:t>Chapter 4: System Design &amp; Architecture</w:t>
       </w:r>
       <w:r>
         <w:tab/>
-        <w:t>24</w:t>
+        <w:t>27</w:t>
       </w:r>
     </w:p>
     <w:p>
@@ -1138,11 +1157,11 @@
           <w:rFonts w:ascii="Times New Roman" w:hAnsi="Times New Roman"/>
           <w:sz w:val="22"/>
         </w:rPr>
-        <w:t xml:space="preserve">   4.1 Architecture Framework (Three-Tier)</w:t>
+        <w:t xml:space="preserve">   4.1 Architecture Frame (Three-Tier Decoupling)</w:t>
       </w:r>
       <w:r>
         <w:tab/>
-        <w:t>24</w:t>
+        <w:t>27</w:t>
       </w:r>
     </w:p>
     <w:p>
@@ -1157,11 +1176,11 @@
           <w:rFonts w:ascii="Times New Roman" w:hAnsi="Times New Roman"/>
           <w:sz w:val="22"/>
         </w:rPr>
-        <w:t xml:space="preserve">   4.2 Database Design &amp; Schemas</w:t>
+        <w:t xml:space="preserve">   4.2 UML Use Case System Interfacing Model</w:t>
       </w:r>
       <w:r>
         <w:tab/>
-        <w:t>26</w:t>
+        <w:t>29</w:t>
       </w:r>
     </w:p>
     <w:p>
@@ -1176,11 +1195,11 @@
           <w:rFonts w:ascii="Times New Roman" w:hAnsi="Times New Roman"/>
           <w:sz w:val="22"/>
         </w:rPr>
-        <w:t xml:space="preserve">   4.3 Dynamic Sequence Workflows</w:t>
+        <w:t xml:space="preserve">   4.3 Database Schema &amp; Data Dictionary DDL</w:t>
       </w:r>
       <w:r>
         <w:tab/>
-        <w:t>28</w:t>
+        <w:t>31</w:t>
       </w:r>
     </w:p>
     <w:p>
@@ -1195,11 +1214,49 @@
           <w:rFonts w:ascii="Times New Roman" w:hAnsi="Times New Roman"/>
           <w:sz w:val="22"/>
         </w:rPr>
-        <w:t xml:space="preserve">   4.4 Deployment Topology (Docker Orchestration)</w:t>
+        <w:t xml:space="preserve">   4.4 Process Flows &amp; Activity Diagrams</w:t>
       </w:r>
       <w:r>
         <w:tab/>
-        <w:t>30</w:t>
+        <w:t>33</w:t>
+      </w:r>
+    </w:p>
+    <w:p>
+      <w:pPr>
+        <w:tabs>
+          <w:tab w:pos="8640" w:val="right" w:leader="dot"/>
+        </w:tabs>
+        <w:spacing w:before="0" w:after="40" w:line="276" w:lineRule="auto"/>
+      </w:pPr>
+      <w:r>
+        <w:rPr>
+          <w:rFonts w:ascii="Times New Roman" w:hAnsi="Times New Roman"/>
+          <w:sz w:val="22"/>
+        </w:rPr>
+        <w:t xml:space="preserve">   4.5 Telemetry Sequence Lifelines Execution</w:t>
+      </w:r>
+      <w:r>
+        <w:tab/>
+        <w:t>35</w:t>
+      </w:r>
+    </w:p>
+    <w:p>
+      <w:pPr>
+        <w:tabs>
+          <w:tab w:pos="8640" w:val="right" w:leader="dot"/>
+        </w:tabs>
+        <w:spacing w:before="0" w:after="40" w:line="276" w:lineRule="auto"/>
+      </w:pPr>
+      <w:r>
+        <w:rPr>
+          <w:rFonts w:ascii="Times New Roman" w:hAnsi="Times New Roman"/>
+          <w:sz w:val="22"/>
+        </w:rPr>
+        <w:t xml:space="preserve">   4.6 Deployment Topology &amp; Container Network</w:t>
+      </w:r>
+      <w:r>
+        <w:tab/>
+        <w:t>37</w:t>
       </w:r>
     </w:p>
     <w:p>
@@ -1215,11 +1272,11 @@
           <w:b/>
           <w:sz w:val="22"/>
         </w:rPr>
-        <w:t>Chapter 5: Technology Stack</w:t>
+        <w:t>Chapter 5: Detailed Technology Stack</w:t>
       </w:r>
       <w:r>
         <w:tab/>
-        <w:t>33</w:t>
+        <w:t>40</w:t>
       </w:r>
     </w:p>
     <w:p>
@@ -1234,11 +1291,11 @@
           <w:rFonts w:ascii="Times New Roman" w:hAnsi="Times New Roman"/>
           <w:sz w:val="22"/>
         </w:rPr>
-        <w:t xml:space="preserve">   5.1 Java &amp; Servlet API</w:t>
+        <w:t xml:space="preserve">   5.1 Java 17 LTS Backend &amp; Servlet API Engine</w:t>
       </w:r>
       <w:r>
         <w:tab/>
-        <w:t>33</w:t>
+        <w:t>40</w:t>
       </w:r>
     </w:p>
     <w:p>
@@ -1253,11 +1310,11 @@
           <w:rFonts w:ascii="Times New Roman" w:hAnsi="Times New Roman"/>
           <w:sz w:val="22"/>
         </w:rPr>
-        <w:t xml:space="preserve">   5.2 Leaflet JS Mapping Client</w:t>
+        <w:t xml:space="preserve">   5.2 Leaflet Map Interface Rendering Framework</w:t>
       </w:r>
       <w:r>
         <w:tab/>
-        <w:t>34</w:t>
+        <w:t>42</w:t>
       </w:r>
     </w:p>
     <w:p>
@@ -1272,11 +1329,11 @@
           <w:rFonts w:ascii="Times New Roman" w:hAnsi="Times New Roman"/>
           <w:sz w:val="22"/>
         </w:rPr>
-        <w:t xml:space="preserve">   5.3 PostgreSQL &amp; PostGIS Integration</w:t>
+        <w:t xml:space="preserve">   5.3 PostgreSQL Database &amp; PostGIS Extensions</w:t>
       </w:r>
       <w:r>
         <w:tab/>
-        <w:t>36</w:t>
+        <w:t>44</w:t>
       </w:r>
     </w:p>
     <w:p>
@@ -1291,11 +1348,11 @@
           <w:rFonts w:ascii="Times New Roman" w:hAnsi="Times New Roman"/>
           <w:sz w:val="22"/>
         </w:rPr>
-        <w:t xml:space="preserve">   5.4 GeoServer Rendering Engine</w:t>
+        <w:t xml:space="preserve">   5.4 GeoServer GIS Map Publishing Engine</w:t>
       </w:r>
       <w:r>
         <w:tab/>
-        <w:t>38</w:t>
+        <w:t>46</w:t>
       </w:r>
     </w:p>
     <w:p>
@@ -1310,11 +1367,11 @@
           <w:rFonts w:ascii="Times New Roman" w:hAnsi="Times New Roman"/>
           <w:sz w:val="22"/>
         </w:rPr>
-        <w:t xml:space="preserve">   5.5 Apache Tomcat &amp; Maven Build System</w:t>
+        <w:t xml:space="preserve">   5.5 Apache Tomcat Server &amp; Maven Build Tool</w:t>
       </w:r>
       <w:r>
         <w:tab/>
-        <w:t>40</w:t>
+        <w:t>48</w:t>
       </w:r>
     </w:p>
     <w:p>
@@ -1334,7 +1391,7 @@
       </w:r>
       <w:r>
         <w:tab/>
-        <w:t>43</w:t>
+        <w:t>51</w:t>
       </w:r>
     </w:p>
     <w:p>
@@ -1349,11 +1406,11 @@
           <w:rFonts w:ascii="Times New Roman" w:hAnsi="Times New Roman"/>
           <w:sz w:val="22"/>
         </w:rPr>
-        <w:t xml:space="preserve">   6.1 Security &amp; Session Authorization Filters</w:t>
+        <w:t xml:space="preserve">   6.1 Security Gateways &amp; BCrypt Hash Filters</w:t>
       </w:r>
       <w:r>
         <w:tab/>
-        <w:t>43</w:t>
+        <w:t>51</w:t>
       </w:r>
     </w:p>
     <w:p>
@@ -1372,7 +1429,7 @@
       </w:r>
       <w:r>
         <w:tab/>
-        <w:t>45</w:t>
+        <w:t>53</w:t>
       </w:r>
     </w:p>
     <w:p>
@@ -1391,7 +1448,7 @@
       </w:r>
       <w:r>
         <w:tab/>
-        <w:t>47</w:t>
+        <w:t>55</w:t>
       </w:r>
     </w:p>
     <w:p>
@@ -1410,7 +1467,7 @@
       </w:r>
       <w:r>
         <w:tab/>
-        <w:t>49</w:t>
+        <w:t>57</w:t>
       </w:r>
     </w:p>
     <w:p>
@@ -1430,7 +1487,7 @@
       </w:r>
       <w:r>
         <w:tab/>
-        <w:t>52</w:t>
+        <w:t>60</w:t>
       </w:r>
     </w:p>
     <w:p>
@@ -1449,7 +1506,7 @@
       </w:r>
       <w:r>
         <w:tab/>
-        <w:t>52</w:t>
+        <w:t>60</w:t>
       </w:r>
     </w:p>
     <w:p>
@@ -1468,7 +1525,7 @@
       </w:r>
       <w:r>
         <w:tab/>
-        <w:t>54</w:t>
+        <w:t>62</w:t>
       </w:r>
     </w:p>
     <w:p>
@@ -1487,7 +1544,7 @@
       </w:r>
       <w:r>
         <w:tab/>
-        <w:t>56</w:t>
+        <w:t>64</w:t>
       </w:r>
     </w:p>
     <w:p>
@@ -1507,7 +1564,7 @@
       </w:r>
       <w:r>
         <w:tab/>
-        <w:t>59</w:t>
+        <w:t>67</w:t>
       </w:r>
     </w:p>
     <w:p>
@@ -1526,7 +1583,7 @@
       </w:r>
       <w:r>
         <w:tab/>
-        <w:t>59</w:t>
+        <w:t>67</w:t>
       </w:r>
     </w:p>
     <w:p>
@@ -1545,7 +1602,7 @@
       </w:r>
       <w:r>
         <w:tab/>
-        <w:t>61</w:t>
+        <w:t>69</w:t>
       </w:r>
     </w:p>
     <w:p>
@@ -1564,7 +1621,7 @@
       </w:r>
       <w:r>
         <w:tab/>
-        <w:t>63</w:t>
+        <w:t>71</w:t>
       </w:r>
     </w:p>
     <w:p>
@@ -1584,7 +1641,7 @@
       </w:r>
       <w:r>
         <w:tab/>
-        <w:t>66</w:t>
+        <w:t>74</w:t>
       </w:r>
     </w:p>
     <w:p>
@@ -1603,7 +1660,7 @@
       </w:r>
       <w:r>
         <w:tab/>
-        <w:t>66</w:t>
+        <w:t>74</w:t>
       </w:r>
     </w:p>
     <w:p>
@@ -1622,7 +1679,7 @@
       </w:r>
       <w:r>
         <w:tab/>
-        <w:t>67</w:t>
+        <w:t>75</w:t>
       </w:r>
     </w:p>
     <w:p>
@@ -1641,7 +1698,7 @@
       </w:r>
       <w:r>
         <w:tab/>
-        <w:t>69</w:t>
+        <w:t>77</w:t>
       </w:r>
     </w:p>
     <w:p>
@@ -1661,7 +1718,7 @@
       </w:r>
       <w:r>
         <w:tab/>
-        <w:t>72</w:t>
+        <w:t>80</w:t>
       </w:r>
     </w:p>
     <w:p>
@@ -1680,7 +1737,7 @@
       </w:r>
       <w:r>
         <w:tab/>
-        <w:t>72</w:t>
+        <w:t>80</w:t>
       </w:r>
     </w:p>
     <w:p>
@@ -1699,7 +1756,7 @@
       </w:r>
       <w:r>
         <w:tab/>
-        <w:t>74</w:t>
+        <w:t>82</w:t>
       </w:r>
     </w:p>
     <w:p>
@@ -1719,7 +1776,7 @@
       </w:r>
       <w:r>
         <w:tab/>
-        <w:t>77</w:t>
+        <w:t>85</w:t>
       </w:r>
     </w:p>
     <w:p>
@@ -1739,7 +1796,7 @@
       </w:r>
       <w:r>
         <w:tab/>
-        <w:t>79</w:t>
+        <w:t>87</w:t>
       </w:r>
     </w:p>
     <w:p>
@@ -1759,7 +1816,7 @@
       </w:r>
       <w:r>
         <w:tab/>
-        <w:t>81</w:t>
+        <w:t>89</w:t>
       </w:r>
     </w:p>
     <w:p>
@@ -1778,7 +1835,7 @@
       </w:r>
       <w:r>
         <w:tab/>
-        <w:t>81</w:t>
+        <w:t>89</w:t>
       </w:r>
     </w:p>
     <w:p>
@@ -1797,7 +1854,7 @@
       </w:r>
       <w:r>
         <w:tab/>
-        <w:t>82</w:t>
+        <w:t>90</w:t>
       </w:r>
     </w:p>
     <w:p>
@@ -1816,7 +1873,7 @@
       </w:r>
       <w:r>
         <w:tab/>
-        <w:t>84</w:t>
+        <w:t>92</w:t>
       </w:r>
     </w:p>
     <w:p>
@@ -1835,7 +1892,7 @@
       </w:r>
       <w:r>
         <w:tab/>
-        <w:t>86</w:t>
+        <w:t>94</w:t>
       </w:r>
     </w:p>
     <w:p>
@@ -1855,7 +1912,7 @@
       </w:r>
       <w:r>
         <w:tab/>
-        <w:t>89</w:t>
+        <w:t>97</w:t>
       </w:r>
     </w:p>
     <w:p>
@@ -1874,7 +1931,7 @@
           <w:rFonts w:ascii="Times New Roman" w:hAnsi="Times New Roman"/>
           <w:b/>
           <w:color w:val="000000"/>
-          <w:sz w:val="32"/>
+          <w:sz w:val="28"/>
         </w:rPr>
         <w:t>ABBREVIATIONS</w:t>
       </w:r>
@@ -2961,7 +3018,7 @@
           <w:rFonts w:ascii="Times New Roman" w:hAnsi="Times New Roman"/>
           <w:b/>
           <w:color w:val="000000"/>
-          <w:sz w:val="32"/>
+          <w:sz w:val="28"/>
         </w:rPr>
         <w:t>CHAPTER 1: INTRODUCTION</w:t>
       </w:r>
@@ -2977,7 +3034,7 @@
           <w:rFonts w:ascii="Times New Roman" w:hAnsi="Times New Roman"/>
           <w:b/>
           <w:color w:val="323232"/>
-          <w:sz w:val="28"/>
+          <w:sz w:val="24"/>
         </w:rPr>
         <w:t>1.1 Organization Profile: DRDO &amp; DLJ</w:t>
       </w:r>
@@ -3021,9 +3078,44 @@
           <w:rFonts w:ascii="Times New Roman" w:hAnsi="Times New Roman"/>
           <w:b/>
           <w:color w:val="323232"/>
-          <w:sz w:val="28"/>
+          <w:sz w:val="24"/>
         </w:rPr>
-        <w:t>1.2 Internship Overview</w:t>
+        <w:t>1.2 DLJ Technical Divisions &amp; Camouflage</w:t>
+      </w:r>
+    </w:p>
+    <w:p>
+      <w:pPr>
+        <w:spacing w:before="0" w:after="120" w:line="360" w:lineRule="auto"/>
+        <w:jc w:val="both"/>
+      </w:pPr>
+      <w:r>
+        <w:rPr>
+          <w:rFonts w:ascii="Times New Roman" w:hAnsi="Times New Roman"/>
+          <w:sz w:val="24"/>
+        </w:rPr>
+        <w:t>Defence Laboratory Jodhpur (DLJ) is structured into several specialized divisions that focus on specific areas of strategic significance. These divisions collaborate to translate basic research into advanced systems for the Indian Armed Forces:</w:t>
+        <w:br/>
+        <w:t>• **Camouflage Division**: Focuses on design and development of multispectral camouflage materials and technologies for signature management of ground-based vehicles, bunkers, and aircraft systems. It works to reduce thermal, radar, and visual signatures of combat assets.</w:t>
+        <w:br/>
+        <w:t>• **Nuclear Radiation Management and Application (NRMA)**: Conducts research on advanced radiation detectors, dosimeters, dose rate meters, and area monitoring sensors, providing calibrated tracking systems traceable to national bodies (NABL/BARC).</w:t>
+        <w:br/>
+        <w:t>• **Desert Environment Science and Technology (DEST)**: Specialized in studying water stabilization, soil compaction, terrain analysis, and heat management technologies to support logistics and troop operations under harsh desert environments.</w:t>
+      </w:r>
+    </w:p>
+    <w:p>
+      <w:pPr>
+        <w:pStyle w:val="Heading2"/>
+        <w:keepNext/>
+        <w:spacing w:before="240" w:after="120"/>
+      </w:pPr>
+      <w:r>
+        <w:rPr>
+          <w:rFonts w:ascii="Times New Roman" w:hAnsi="Times New Roman"/>
+          <w:b/>
+          <w:color w:val="323232"/>
+          <w:sz w:val="24"/>
+        </w:rPr>
+        <w:t>1.3 Internship Scope Overview</w:t>
       </w:r>
     </w:p>
     <w:p>
@@ -3050,9 +3142,9 @@
           <w:rFonts w:ascii="Times New Roman" w:hAnsi="Times New Roman"/>
           <w:b/>
           <w:color w:val="323232"/>
-          <w:sz w:val="28"/>
+          <w:sz w:val="24"/>
         </w:rPr>
-        <w:t>1.3 Problem Statement</w:t>
+        <w:t>1.4 Technical Problem Statement</w:t>
       </w:r>
     </w:p>
     <w:p>
@@ -3079,9 +3171,9 @@
           <w:rFonts w:ascii="Times New Roman" w:hAnsi="Times New Roman"/>
           <w:b/>
           <w:color w:val="323232"/>
-          <w:sz w:val="28"/>
+          <w:sz w:val="24"/>
         </w:rPr>
-        <w:t>1.4 Proposed System Solution</w:t>
+        <w:t>1.5 Proposed Spatial Intelligence Solution</w:t>
       </w:r>
     </w:p>
     <w:p>
@@ -3108,9 +3200,9 @@
           <w:rFonts w:ascii="Times New Roman" w:hAnsi="Times New Roman"/>
           <w:b/>
           <w:color w:val="323232"/>
-          <w:sz w:val="28"/>
+          <w:sz w:val="24"/>
         </w:rPr>
-        <w:t>1.5 Project Scope and Objectives</w:t>
+        <w:t>1.6 Specific Project Objectives</w:t>
       </w:r>
     </w:p>
     <w:p>
@@ -3232,7 +3324,7 @@
           <w:rFonts w:ascii="Times New Roman" w:hAnsi="Times New Roman"/>
           <w:b/>
           <w:color w:val="000000"/>
-          <w:sz w:val="32"/>
+          <w:sz w:val="28"/>
         </w:rPr>
         <w:t>CHAPTER 2: LITERATURE SURVEY</w:t>
       </w:r>
@@ -3248,9 +3340,9 @@
           <w:rFonts w:ascii="Times New Roman" w:hAnsi="Times New Roman"/>
           <w:b/>
           <w:color w:val="323232"/>
-          <w:sz w:val="28"/>
+          <w:sz w:val="24"/>
         </w:rPr>
-        <w:t>2.1 Geographic Information Systems (GIS)</w:t>
+        <w:t>2.1 Geographic Information Systems (GIS) Evolution</w:t>
       </w:r>
     </w:p>
     <w:p>
@@ -3277,9 +3369,9 @@
           <w:rFonts w:ascii="Times New Roman" w:hAnsi="Times New Roman"/>
           <w:b/>
           <w:color w:val="323232"/>
-          <w:sz w:val="28"/>
+          <w:sz w:val="24"/>
         </w:rPr>
-        <w:t>2.2 OGC Mapping Web Services (WMS/WFS)</w:t>
+        <w:t>2.2 OGC Specifications &amp; WMS/WFS Services</w:t>
       </w:r>
     </w:p>
     <w:p>
@@ -3306,9 +3398,9 @@
           <w:rFonts w:ascii="Times New Roman" w:hAnsi="Times New Roman"/>
           <w:b/>
           <w:color w:val="323232"/>
-          <w:sz w:val="28"/>
+          <w:sz w:val="24"/>
         </w:rPr>
-        <w:t>2.3 Relational Spatial Databases &amp; PostGIS</w:t>
+        <w:t>2.3 Spatial Databasing Mechanics: PostGIS</w:t>
       </w:r>
     </w:p>
     <w:p>
@@ -3335,9 +3427,9 @@
           <w:rFonts w:ascii="Times New Roman" w:hAnsi="Times New Roman"/>
           <w:b/>
           <w:color w:val="323232"/>
-          <w:sz w:val="28"/>
+          <w:sz w:val="24"/>
         </w:rPr>
-        <w:t>2.4 Geofencing Algorithms &amp; Topologies</w:t>
+        <w:t>2.4 Geofencing containment: Ray-Casting Logic</w:t>
       </w:r>
     </w:p>
     <w:p>
@@ -3369,7 +3461,7 @@
           <w:rFonts w:ascii="Times New Roman" w:hAnsi="Times New Roman"/>
           <w:b/>
           <w:color w:val="000000"/>
-          <w:sz w:val="32"/>
+          <w:sz w:val="28"/>
         </w:rPr>
         <w:t>CHAPTER 3: REQUIREMENT ANALYSIS</w:t>
       </w:r>
@@ -3385,9 +3477,9 @@
           <w:rFonts w:ascii="Times New Roman" w:hAnsi="Times New Roman"/>
           <w:b/>
           <w:color w:val="323232"/>
-          <w:sz w:val="28"/>
+          <w:sz w:val="24"/>
         </w:rPr>
-        <w:t>3.1 Functional Requirements</w:t>
+        <w:t>3.1 Detailed Functional Modules Specifications</w:t>
       </w:r>
     </w:p>
     <w:p>
@@ -3415,7 +3507,7 @@
         </w:rPr>
       </w:r>
       <w:r>
-        <w:t xml:space="preserve">  • **Asset Telemetry Logging**: System must record incoming GPS coordinates, speed, heading, and altitude for 15+ assets.</w:t>
+        <w:t xml:space="preserve">  • **Asset Telemetry Ingestion**: The system must expose endpoint `/api/positions` to parse and store incoming GPS packets, including speed, altitude, and heading.</w:t>
       </w:r>
     </w:p>
     <w:p>
@@ -3430,7 +3522,7 @@
         </w:rPr>
       </w:r>
       <w:r>
-        <w:t xml:space="preserve">  • **Geofencing Analysis**: Automatically compute containment on every position update. Identify breaches of restricted zones.</w:t>
+        <w:t xml:space="preserve">  • **Real-time Geofence Boundary Check**: The system must run spatial ST_Contains queries automatically when coordinates are written to the database.</w:t>
       </w:r>
     </w:p>
     <w:p>
@@ -3445,7 +3537,7 @@
         </w:rPr>
       </w:r>
       <w:r>
-        <w:t xml:space="preserve">  • **Real-time Alerts Feed**: Log alerts (ENTER, EXIT, SOS, SPEED, OFFLINE) with severity (CRITICAL, HIGH, MEDIUM, LOW) and support operator acknowledgement.</w:t>
+        <w:t xml:space="preserve">  • **Alert Dispatching Engine**: Alarm rows must be populated inside the `alerts` table on breaches (ENTER, EXIT, SOS). It must support severity markings.</w:t>
       </w:r>
     </w:p>
     <w:p>
@@ -3460,7 +3552,7 @@
         </w:rPr>
       </w:r>
       <w:r>
-        <w:t xml:space="preserve">  • **Tactical Map Visualizer**: Render live positions, geofences, and paths using Leaflet overlays and WMS tiles.</w:t>
+        <w:t xml:space="preserve">  • **GIS Vector Layer Rendering**: Map clients must pull pre-rendered WMS tiles from GeoServer displaying active asset paths.</w:t>
       </w:r>
     </w:p>
     <w:p>
@@ -3475,7 +3567,7 @@
         </w:rPr>
       </w:r>
       <w:r>
-        <w:t xml:space="preserve">  • **Report Compilation**: Generate customized search summaries filtering positions, alerts, and user audit logs.</w:t>
+        <w:t xml:space="preserve">  • **Historical Track Assembly**: A custom SQL query must build LineString histories from coordinates, allowing path playback.</w:t>
       </w:r>
     </w:p>
     <w:p>
@@ -3490,7 +3582,7 @@
         </w:rPr>
       </w:r>
       <w:r>
-        <w:t xml:space="preserve">  • **User Session Guarding**: Validate credentials (drdo, admin, mahendra) and enforce authorization filters on all '/api/*' routes.</w:t>
+        <w:t xml:space="preserve">  • **Security &amp; Credentials Manager**: Session-validation filter controls access routes under `/api/*` context paths.</w:t>
       </w:r>
     </w:p>
     <w:p>
@@ -3504,9 +3596,9 @@
           <w:rFonts w:ascii="Times New Roman" w:hAnsi="Times New Roman"/>
           <w:b/>
           <w:color w:val="323232"/>
-          <w:sz w:val="28"/>
+          <w:sz w:val="24"/>
         </w:rPr>
-        <w:t>3.2 Non-Functional Requirements</w:t>
+        <w:t>3.2 Technical Non-Functional Standards</w:t>
       </w:r>
     </w:p>
     <w:p>
@@ -3608,9 +3700,9 @@
           <w:rFonts w:ascii="Times New Roman" w:hAnsi="Times New Roman"/>
           <w:b/>
           <w:color w:val="323232"/>
-          <w:sz w:val="28"/>
+          <w:sz w:val="24"/>
         </w:rPr>
-        <w:t>3.3 Hardware Specifications</w:t>
+        <w:t>3.3 Target Hardware Resource Specifications</w:t>
       </w:r>
     </w:p>
     <w:p>
@@ -3904,9 +3996,9 @@
           <w:rFonts w:ascii="Times New Roman" w:hAnsi="Times New Roman"/>
           <w:b/>
           <w:color w:val="323232"/>
-          <w:sz w:val="28"/>
+          <w:sz w:val="24"/>
         </w:rPr>
-        <w:t>3.4 Software Runtime Environment</w:t>
+        <w:t>3.4 Software Runtimes Configuration Matrix</w:t>
       </w:r>
     </w:p>
     <w:p>
@@ -3983,9 +4075,9 @@
           <w:rFonts w:ascii="Times New Roman" w:hAnsi="Times New Roman"/>
           <w:b/>
           <w:color w:val="000000"/>
-          <w:sz w:val="32"/>
+          <w:sz w:val="28"/>
         </w:rPr>
-        <w:t>CHAPTER 4: SYSTEM DESIGN</w:t>
+        <w:t>CHAPTER 4: SYSTEM DESIGN &amp; ARCHITECTURE</w:t>
       </w:r>
     </w:p>
     <w:p>
@@ -3999,9 +4091,9 @@
           <w:rFonts w:ascii="Times New Roman" w:hAnsi="Times New Roman"/>
           <w:b/>
           <w:color w:val="323232"/>
-          <w:sz w:val="28"/>
+          <w:sz w:val="24"/>
         </w:rPr>
-        <w:t>4.1 Architecture Framework (Three-Tier)</w:t>
+        <w:t>4.1 Architecture Frame (Three-Tier Decoupling)</w:t>
       </w:r>
     </w:p>
     <w:p>
@@ -4115,9 +4207,106 @@
           <w:rFonts w:ascii="Times New Roman" w:hAnsi="Times New Roman"/>
           <w:b/>
           <w:color w:val="323232"/>
-          <w:sz w:val="28"/>
+          <w:sz w:val="24"/>
         </w:rPr>
-        <w:t>4.2 Database Design &amp; Schemas</w:t>
+        <w:t>4.2 UML Use Case System Interfacing Model</w:t>
+      </w:r>
+    </w:p>
+    <w:p>
+      <w:pPr>
+        <w:spacing w:before="0" w:after="120" w:line="360" w:lineRule="auto"/>
+        <w:jc w:val="both"/>
+      </w:pPr>
+      <w:r>
+        <w:rPr>
+          <w:rFonts w:ascii="Times New Roman" w:hAnsi="Times New Roman"/>
+          <w:sz w:val="24"/>
+        </w:rPr>
+        <w:t>The UML Use Case Diagram isolates interactions between system actors (Field Asset, Command Operator, GIS Administrator) and internal system features. This models the user permissions boundaries for each login role.</w:t>
+      </w:r>
+    </w:p>
+    <w:p>
+      <w:pPr>
+        <w:jc w:val="center"/>
+      </w:pPr>
+      <w:r>
+        <w:drawing>
+          <wp:inline xmlns:a="http://schemas.openxmlformats.org/drawingml/2006/main" xmlns:pic="http://schemas.openxmlformats.org/drawingml/2006/picture">
+            <wp:extent cx="5486400" cy="2873829"/>
+            <wp:docPr id="2" name="Picture 2"/>
+            <wp:cNvGraphicFramePr>
+              <a:graphicFrameLocks noChangeAspect="1"/>
+            </wp:cNvGraphicFramePr>
+            <a:graphic>
+              <a:graphicData uri="http://schemas.openxmlformats.org/drawingml/2006/picture">
+                <pic:pic>
+                  <pic:nvPicPr>
+                    <pic:cNvPr id="0" name="diag_use_case.png"/>
+                    <pic:cNvPicPr/>
+                  </pic:nvPicPr>
+                  <pic:blipFill>
+                    <a:blip r:embed="rId12"/>
+                    <a:stretch>
+                      <a:fillRect/>
+                    </a:stretch>
+                  </pic:blipFill>
+                  <pic:spPr>
+                    <a:xfrm>
+                      <a:off x="0" y="0"/>
+                      <a:ext cx="5486400" cy="2873829"/>
+                    </a:xfrm>
+                    <a:prstGeom prst="rect"/>
+                  </pic:spPr>
+                </pic:pic>
+              </a:graphicData>
+            </a:graphic>
+          </wp:inline>
+        </w:drawing>
+      </w:r>
+    </w:p>
+    <w:p>
+      <w:pPr>
+        <w:spacing w:before="80" w:after="240"/>
+        <w:jc w:val="center"/>
+      </w:pPr>
+      <w:r>
+        <w:rPr>
+          <w:rFonts w:ascii="Times New Roman" w:hAnsi="Times New Roman"/>
+          <w:b/>
+          <w:i/>
+          <w:sz w:val="20"/>
+        </w:rPr>
+        <w:t>Figure 4.2: UML Use Case Interfacing Diagram</w:t>
+      </w:r>
+    </w:p>
+    <w:p>
+      <w:pPr>
+        <w:spacing w:before="0" w:after="120" w:line="360" w:lineRule="auto"/>
+        <w:jc w:val="both"/>
+      </w:pPr>
+      <w:r>
+        <w:rPr>
+          <w:rFonts w:ascii="Times New Roman" w:hAnsi="Times New Roman"/>
+          <w:i/>
+          <w:sz w:val="24"/>
+        </w:rPr>
+        <w:t>Figure 4.2 represents how different system actors trigger use cases. The field asset pushes GPS data, the command operator monitors alerts and tracks, and the GIS administrator publishes vector styles.</w:t>
+      </w:r>
+    </w:p>
+    <w:p>
+      <w:pPr>
+        <w:pStyle w:val="Heading2"/>
+        <w:keepNext/>
+        <w:spacing w:before="240" w:after="120"/>
+      </w:pPr>
+      <w:r>
+        <w:rPr>
+          <w:rFonts w:ascii="Times New Roman" w:hAnsi="Times New Roman"/>
+          <w:b/>
+          <w:color w:val="323232"/>
+          <w:sz w:val="24"/>
+        </w:rPr>
+        <w:t>4.3 Database Schema &amp; Data Dictionary DDL</w:t>
       </w:r>
     </w:p>
     <w:p>
@@ -4251,7 +4440,7 @@
         <w:drawing>
           <wp:inline xmlns:a="http://schemas.openxmlformats.org/drawingml/2006/main" xmlns:pic="http://schemas.openxmlformats.org/drawingml/2006/picture">
             <wp:extent cx="5486400" cy="6839279"/>
-            <wp:docPr id="2" name="Picture 2"/>
+            <wp:docPr id="3" name="Picture 3"/>
             <wp:cNvGraphicFramePr>
               <a:graphicFrameLocks noChangeAspect="1"/>
             </wp:cNvGraphicFramePr>
@@ -4263,7 +4452,7 @@
                     <pic:cNvPicPr/>
                   </pic:nvPicPr>
                   <pic:blipFill>
-                    <a:blip r:embed="rId12"/>
+                    <a:blip r:embed="rId13"/>
                     <a:stretch>
                       <a:fillRect/>
                     </a:stretch>
@@ -4294,7 +4483,7 @@
           <w:i/>
           <w:sz w:val="20"/>
         </w:rPr>
-        <w:t>Figure 4.6: Entity Relationship Diagram (ERD) of Defence GIS database</w:t>
+        <w:t>Figure 4.3: Entity Relationship Diagram (ERD) of Defence GIS database</w:t>
       </w:r>
     </w:p>
     <w:p>
@@ -4308,7 +4497,7 @@
           <w:i/>
           <w:sz w:val="24"/>
         </w:rPr>
-        <w:t>Figure 4.6 provides a complete database data-dictionary schema mapping all primary key, foreign key linkages, data types, and index locations.</w:t>
+        <w:t>Figure 4.3 provides a complete database data-dictionary schema mapping all primary key, foreign key linkages, data types, and index locations.</w:t>
       </w:r>
     </w:p>
     <w:p>
@@ -4322,9 +4511,9 @@
           <w:rFonts w:ascii="Times New Roman" w:hAnsi="Times New Roman"/>
           <w:b/>
           <w:color w:val="323232"/>
-          <w:sz w:val="28"/>
+          <w:sz w:val="24"/>
         </w:rPr>
-        <w:t>4.3 Dynamic Sequence Workflows</w:t>
+        <w:t>4.4 Process Flows &amp; Activity Diagrams</w:t>
       </w:r>
     </w:p>
     <w:p>
@@ -4337,165 +4526,7 @@
           <w:rFonts w:ascii="Times New Roman" w:hAnsi="Times New Roman"/>
           <w:sz w:val="24"/>
         </w:rPr>
-        <w:t>The runtime sequence executes automatically on coordinate ingestion:</w:t>
-      </w:r>
-    </w:p>
-    <w:p>
-      <w:pPr>
-        <w:spacing w:before="0" w:after="80" w:line="360" w:lineRule="auto"/>
-        <w:jc w:val="both"/>
-      </w:pPr>
-      <w:r>
-        <w:rPr>
-          <w:rFonts w:ascii="Times New Roman" w:hAnsi="Times New Roman"/>
-          <w:sz w:val="24"/>
-        </w:rPr>
-      </w:r>
-      <w:r>
-        <w:t xml:space="preserve">  • **Ingestion**: An asset sends its GPS coordinate payload (longitude, latitude, speed, heading) via REST API POST to `/api/positions`.</w:t>
-      </w:r>
-    </w:p>
-    <w:p>
-      <w:pPr>
-        <w:spacing w:before="0" w:after="80" w:line="360" w:lineRule="auto"/>
-        <w:jc w:val="both"/>
-      </w:pPr>
-      <w:r>
-        <w:rPr>
-          <w:rFonts w:ascii="Times New Roman" w:hAnsi="Times New Roman"/>
-          <w:sz w:val="24"/>
-        </w:rPr>
-      </w:r>
-      <w:r>
-        <w:t xml:space="preserve">  • **JDBC Insertion**: The PositionServlet validates the session, maps values, and writes a new row to `asset_positions`.</w:t>
-      </w:r>
-    </w:p>
-    <w:p>
-      <w:pPr>
-        <w:spacing w:before="0" w:after="80" w:line="360" w:lineRule="auto"/>
-        <w:jc w:val="both"/>
-      </w:pPr>
-      <w:r>
-        <w:rPr>
-          <w:rFonts w:ascii="Times New Roman" w:hAnsi="Times New Roman"/>
-          <w:sz w:val="24"/>
-        </w:rPr>
-      </w:r>
-      <w:r>
-        <w:t xml:space="preserve">  • **SQL Trigger**: PostgreSQL intercepts the insert. The `trg_geofence_check` trigger fires, invoking `trigger_geofence_check()`.</w:t>
-      </w:r>
-    </w:p>
-    <w:p>
-      <w:pPr>
-        <w:spacing w:before="0" w:after="80" w:line="360" w:lineRule="auto"/>
-        <w:jc w:val="both"/>
-      </w:pPr>
-      <w:r>
-        <w:rPr>
-          <w:rFonts w:ascii="Times New Roman" w:hAnsi="Times New Roman"/>
-          <w:sz w:val="24"/>
-        </w:rPr>
-      </w:r>
-      <w:r>
-        <w:t xml:space="preserve">  • **Containment Query**: The function runs `ST_Contains(gz.geom, NEW.geom)` against active restricted geofence zones.</w:t>
-      </w:r>
-    </w:p>
-    <w:p>
-      <w:pPr>
-        <w:spacing w:before="0" w:after="80" w:line="360" w:lineRule="auto"/>
-        <w:jc w:val="both"/>
-      </w:pPr>
-      <w:r>
-        <w:rPr>
-          <w:rFonts w:ascii="Times New Roman" w:hAnsi="Times New Roman"/>
-          <w:sz w:val="24"/>
-        </w:rPr>
-      </w:r>
-      <w:r>
-        <w:t xml:space="preserve">  • **Alert Dispatch**: If containment evaluates to true, an entry is inserted into `alerts` table.</w:t>
-      </w:r>
-    </w:p>
-    <w:p>
-      <w:pPr>
-        <w:spacing w:before="0" w:after="80" w:line="360" w:lineRule="auto"/>
-        <w:jc w:val="both"/>
-      </w:pPr>
-      <w:r>
-        <w:rPr>
-          <w:rFonts w:ascii="Times New Roman" w:hAnsi="Times New Roman"/>
-          <w:sz w:val="24"/>
-        </w:rPr>
-      </w:r>
-      <w:r>
-        <w:t xml:space="preserve">  • **Map Update**: The Leaflet client's polling loop queries `/api/positions/latest` and `/api/alerts`, redrawing active markers and triggering flashing callouts on the dashboard.</w:t>
-      </w:r>
-    </w:p>
-    <w:p>
-      <w:pPr>
-        <w:jc w:val="center"/>
-      </w:pPr>
-      <w:r>
-        <w:drawing>
-          <wp:inline xmlns:a="http://schemas.openxmlformats.org/drawingml/2006/main" xmlns:pic="http://schemas.openxmlformats.org/drawingml/2006/picture">
-            <wp:extent cx="5029200" cy="2933700"/>
-            <wp:docPr id="3" name="Picture 3"/>
-            <wp:cNvGraphicFramePr>
-              <a:graphicFrameLocks noChangeAspect="1"/>
-            </wp:cNvGraphicFramePr>
-            <a:graphic>
-              <a:graphicData uri="http://schemas.openxmlformats.org/drawingml/2006/picture">
-                <pic:pic>
-                  <pic:nvPicPr>
-                    <pic:cNvPr id="0" name="diag_workflow.png"/>
-                    <pic:cNvPicPr/>
-                  </pic:nvPicPr>
-                  <pic:blipFill>
-                    <a:blip r:embed="rId13"/>
-                    <a:stretch>
-                      <a:fillRect/>
-                    </a:stretch>
-                  </pic:blipFill>
-                  <pic:spPr>
-                    <a:xfrm>
-                      <a:off x="0" y="0"/>
-                      <a:ext cx="5029200" cy="2933700"/>
-                    </a:xfrm>
-                    <a:prstGeom prst="rect"/>
-                  </pic:spPr>
-                </pic:pic>
-              </a:graphicData>
-            </a:graphic>
-          </wp:inline>
-        </w:drawing>
-      </w:r>
-    </w:p>
-    <w:p>
-      <w:pPr>
-        <w:spacing w:before="80" w:after="240"/>
-        <w:jc w:val="center"/>
-      </w:pPr>
-      <w:r>
-        <w:rPr>
-          <w:rFonts w:ascii="Times New Roman" w:hAnsi="Times New Roman"/>
-          <w:b/>
-          <w:i/>
-          <w:sz w:val="20"/>
-        </w:rPr>
-        <w:t>Figure 4.3: Telemetry Ingestion, Spatial Analysis, and Alerts Workflow Diagram</w:t>
-      </w:r>
-    </w:p>
-    <w:p>
-      <w:pPr>
-        <w:spacing w:before="0" w:after="120" w:line="360" w:lineRule="auto"/>
-        <w:jc w:val="both"/>
-      </w:pPr>
-      <w:r>
-        <w:rPr>
-          <w:rFonts w:ascii="Times New Roman" w:hAnsi="Times New Roman"/>
-          <w:i/>
-          <w:sz w:val="24"/>
-        </w:rPr>
-        <w:t>Figure 4.3 outlines the structural logical steps from coordinates telemetry ingress to geofence containment checks and alarms dispatch.</w:t>
+        <w:t>The Activity Diagram maps operational workflows executed by the dashboard operator during a tactical surveillance session, showing session validation, polling triggers, and reports generation.</w:t>
       </w:r>
     </w:p>
     <w:p>
@@ -4514,7 +4545,7 @@
               <a:graphicData uri="http://schemas.openxmlformats.org/drawingml/2006/picture">
                 <pic:pic>
                   <pic:nvPicPr>
-                    <pic:cNvPr id="0" name="diag_sequence.png"/>
+                    <pic:cNvPr id="0" name="diag_activity.png"/>
                     <pic:cNvPicPr/>
                   </pic:nvPicPr>
                   <pic:blipFill>
@@ -4549,7 +4580,7 @@
           <w:i/>
           <w:sz w:val="20"/>
         </w:rPr>
-        <w:t>Figure 4.4: Ingestion &amp; Breach Detection Sequence Diagram</w:t>
+        <w:t>Figure 4.4: Operator Dashboard Activities Workflow Flowchart</w:t>
       </w:r>
     </w:p>
     <w:p>
@@ -4563,7 +4594,7 @@
           <w:i/>
           <w:sz w:val="24"/>
         </w:rPr>
-        <w:t>Figure 4.4 shows the timeline call sequences between the external asset transceiver, servlet container, database trigger, and frontend GUI panel.</w:t>
+        <w:t>Figure 4.4 describes activities starting from credentials authentication, loop map updates, alerts acknowledgement, to historical data export.</w:t>
       </w:r>
     </w:p>
     <w:p>
@@ -4577,9 +4608,264 @@
           <w:rFonts w:ascii="Times New Roman" w:hAnsi="Times New Roman"/>
           <w:b/>
           <w:color w:val="323232"/>
-          <w:sz w:val="28"/>
+          <w:sz w:val="24"/>
         </w:rPr>
-        <w:t>4.4 Deployment Topology (Docker Orchestration)</w:t>
+        <w:t>4.5 Telemetry Sequence Lifelines Execution</w:t>
+      </w:r>
+    </w:p>
+    <w:p>
+      <w:pPr>
+        <w:spacing w:before="0" w:after="120" w:line="360" w:lineRule="auto"/>
+        <w:jc w:val="both"/>
+      </w:pPr>
+      <w:r>
+        <w:rPr>
+          <w:rFonts w:ascii="Times New Roman" w:hAnsi="Times New Roman"/>
+          <w:sz w:val="24"/>
+        </w:rPr>
+        <w:t>The runtime sequence executes automatically on coordinate ingestion:</w:t>
+      </w:r>
+    </w:p>
+    <w:p>
+      <w:pPr>
+        <w:spacing w:before="0" w:after="80" w:line="360" w:lineRule="auto"/>
+        <w:jc w:val="both"/>
+      </w:pPr>
+      <w:r>
+        <w:rPr>
+          <w:rFonts w:ascii="Times New Roman" w:hAnsi="Times New Roman"/>
+          <w:sz w:val="24"/>
+        </w:rPr>
+      </w:r>
+      <w:r>
+        <w:t xml:space="preserve">  • **Ingestion**: An asset sends its GPS coordinate payload (longitude, latitude, speed, heading) via REST API POST to `/api/positions`.</w:t>
+      </w:r>
+    </w:p>
+    <w:p>
+      <w:pPr>
+        <w:spacing w:before="0" w:after="80" w:line="360" w:lineRule="auto"/>
+        <w:jc w:val="both"/>
+      </w:pPr>
+      <w:r>
+        <w:rPr>
+          <w:rFonts w:ascii="Times New Roman" w:hAnsi="Times New Roman"/>
+          <w:sz w:val="24"/>
+        </w:rPr>
+      </w:r>
+      <w:r>
+        <w:t xml:space="preserve">  • **JDBC Insertion**: The PositionServlet validates the session, maps values, and writes a new row to `asset_positions`.</w:t>
+      </w:r>
+    </w:p>
+    <w:p>
+      <w:pPr>
+        <w:spacing w:before="0" w:after="80" w:line="360" w:lineRule="auto"/>
+        <w:jc w:val="both"/>
+      </w:pPr>
+      <w:r>
+        <w:rPr>
+          <w:rFonts w:ascii="Times New Roman" w:hAnsi="Times New Roman"/>
+          <w:sz w:val="24"/>
+        </w:rPr>
+      </w:r>
+      <w:r>
+        <w:t xml:space="preserve">  • **SQL Trigger**: PostgreSQL intercepts the insert. The `trg_geofence_check` trigger fires, invoking `trigger_geofence_check()`.</w:t>
+      </w:r>
+    </w:p>
+    <w:p>
+      <w:pPr>
+        <w:spacing w:before="0" w:after="80" w:line="360" w:lineRule="auto"/>
+        <w:jc w:val="both"/>
+      </w:pPr>
+      <w:r>
+        <w:rPr>
+          <w:rFonts w:ascii="Times New Roman" w:hAnsi="Times New Roman"/>
+          <w:sz w:val="24"/>
+        </w:rPr>
+      </w:r>
+      <w:r>
+        <w:t xml:space="preserve">  • **Containment Query**: The function runs `ST_Contains(gz.geom, NEW.geom)` against active restricted geofence zones.</w:t>
+      </w:r>
+    </w:p>
+    <w:p>
+      <w:pPr>
+        <w:spacing w:before="0" w:after="80" w:line="360" w:lineRule="auto"/>
+        <w:jc w:val="both"/>
+      </w:pPr>
+      <w:r>
+        <w:rPr>
+          <w:rFonts w:ascii="Times New Roman" w:hAnsi="Times New Roman"/>
+          <w:sz w:val="24"/>
+        </w:rPr>
+      </w:r>
+      <w:r>
+        <w:t xml:space="preserve">  • **Alert Dispatch**: If containment evaluates to true, an entry is inserted into `alerts` table.</w:t>
+      </w:r>
+    </w:p>
+    <w:p>
+      <w:pPr>
+        <w:spacing w:before="0" w:after="80" w:line="360" w:lineRule="auto"/>
+        <w:jc w:val="both"/>
+      </w:pPr>
+      <w:r>
+        <w:rPr>
+          <w:rFonts w:ascii="Times New Roman" w:hAnsi="Times New Roman"/>
+          <w:sz w:val="24"/>
+        </w:rPr>
+      </w:r>
+      <w:r>
+        <w:t xml:space="preserve">  • **Map Update**: The Leaflet client's polling loop queries `/api/positions/latest` and `/api/alerts`, redrawing active markers and triggering flashing callouts on the dashboard.</w:t>
+      </w:r>
+    </w:p>
+    <w:p>
+      <w:pPr>
+        <w:jc w:val="center"/>
+      </w:pPr>
+      <w:r>
+        <w:drawing>
+          <wp:inline xmlns:a="http://schemas.openxmlformats.org/drawingml/2006/main" xmlns:pic="http://schemas.openxmlformats.org/drawingml/2006/picture">
+            <wp:extent cx="5029200" cy="2933700"/>
+            <wp:docPr id="5" name="Picture 5"/>
+            <wp:cNvGraphicFramePr>
+              <a:graphicFrameLocks noChangeAspect="1"/>
+            </wp:cNvGraphicFramePr>
+            <a:graphic>
+              <a:graphicData uri="http://schemas.openxmlformats.org/drawingml/2006/picture">
+                <pic:pic>
+                  <pic:nvPicPr>
+                    <pic:cNvPr id="0" name="diag_workflow.png"/>
+                    <pic:cNvPicPr/>
+                  </pic:nvPicPr>
+                  <pic:blipFill>
+                    <a:blip r:embed="rId15"/>
+                    <a:stretch>
+                      <a:fillRect/>
+                    </a:stretch>
+                  </pic:blipFill>
+                  <pic:spPr>
+                    <a:xfrm>
+                      <a:off x="0" y="0"/>
+                      <a:ext cx="5029200" cy="2933700"/>
+                    </a:xfrm>
+                    <a:prstGeom prst="rect"/>
+                  </pic:spPr>
+                </pic:pic>
+              </a:graphicData>
+            </a:graphic>
+          </wp:inline>
+        </w:drawing>
+      </w:r>
+    </w:p>
+    <w:p>
+      <w:pPr>
+        <w:spacing w:before="80" w:after="240"/>
+        <w:jc w:val="center"/>
+      </w:pPr>
+      <w:r>
+        <w:rPr>
+          <w:rFonts w:ascii="Times New Roman" w:hAnsi="Times New Roman"/>
+          <w:b/>
+          <w:i/>
+          <w:sz w:val="20"/>
+        </w:rPr>
+        <w:t>Figure 4.5: Telemetry Ingestion, Spatial Analysis, and Alerts Workflow Diagram</w:t>
+      </w:r>
+    </w:p>
+    <w:p>
+      <w:pPr>
+        <w:spacing w:before="0" w:after="120" w:line="360" w:lineRule="auto"/>
+        <w:jc w:val="both"/>
+      </w:pPr>
+      <w:r>
+        <w:rPr>
+          <w:rFonts w:ascii="Times New Roman" w:hAnsi="Times New Roman"/>
+          <w:i/>
+          <w:sz w:val="24"/>
+        </w:rPr>
+        <w:t>Figure 4.5 outlines the structural logical steps from coordinates telemetry ingress to geofence containment checks and alarms dispatch.</w:t>
+      </w:r>
+    </w:p>
+    <w:p>
+      <w:pPr>
+        <w:jc w:val="center"/>
+      </w:pPr>
+      <w:r>
+        <w:drawing>
+          <wp:inline xmlns:a="http://schemas.openxmlformats.org/drawingml/2006/main" xmlns:pic="http://schemas.openxmlformats.org/drawingml/2006/picture">
+            <wp:extent cx="5029200" cy="2933700"/>
+            <wp:docPr id="6" name="Picture 6"/>
+            <wp:cNvGraphicFramePr>
+              <a:graphicFrameLocks noChangeAspect="1"/>
+            </wp:cNvGraphicFramePr>
+            <a:graphic>
+              <a:graphicData uri="http://schemas.openxmlformats.org/drawingml/2006/picture">
+                <pic:pic>
+                  <pic:nvPicPr>
+                    <pic:cNvPr id="0" name="diag_sequence.png"/>
+                    <pic:cNvPicPr/>
+                  </pic:nvPicPr>
+                  <pic:blipFill>
+                    <a:blip r:embed="rId16"/>
+                    <a:stretch>
+                      <a:fillRect/>
+                    </a:stretch>
+                  </pic:blipFill>
+                  <pic:spPr>
+                    <a:xfrm>
+                      <a:off x="0" y="0"/>
+                      <a:ext cx="5029200" cy="2933700"/>
+                    </a:xfrm>
+                    <a:prstGeom prst="rect"/>
+                  </pic:spPr>
+                </pic:pic>
+              </a:graphicData>
+            </a:graphic>
+          </wp:inline>
+        </w:drawing>
+      </w:r>
+    </w:p>
+    <w:p>
+      <w:pPr>
+        <w:spacing w:before="80" w:after="240"/>
+        <w:jc w:val="center"/>
+      </w:pPr>
+      <w:r>
+        <w:rPr>
+          <w:rFonts w:ascii="Times New Roman" w:hAnsi="Times New Roman"/>
+          <w:b/>
+          <w:i/>
+          <w:sz w:val="20"/>
+        </w:rPr>
+        <w:t>Figure 4.6: Ingestion &amp; Breach Detection Sequence Diagram</w:t>
+      </w:r>
+    </w:p>
+    <w:p>
+      <w:pPr>
+        <w:spacing w:before="0" w:after="120" w:line="360" w:lineRule="auto"/>
+        <w:jc w:val="both"/>
+      </w:pPr>
+      <w:r>
+        <w:rPr>
+          <w:rFonts w:ascii="Times New Roman" w:hAnsi="Times New Roman"/>
+          <w:i/>
+          <w:sz w:val="24"/>
+        </w:rPr>
+        <w:t>Figure 4.6 shows the timeline call sequences between the external asset transceiver, servlet container, database trigger, and frontend GUI panel.</w:t>
+      </w:r>
+    </w:p>
+    <w:p>
+      <w:pPr>
+        <w:pStyle w:val="Heading2"/>
+        <w:keepNext/>
+        <w:spacing w:before="240" w:after="120"/>
+      </w:pPr>
+      <w:r>
+        <w:rPr>
+          <w:rFonts w:ascii="Times New Roman" w:hAnsi="Times New Roman"/>
+          <w:b/>
+          <w:color w:val="323232"/>
+          <w:sz w:val="24"/>
+        </w:rPr>
+        <w:t>4.4 Deployment Topology &amp; Container Network</w:t>
       </w:r>
     </w:p>
     <w:p>
@@ -4603,7 +4889,7 @@
         <w:drawing>
           <wp:inline xmlns:a="http://schemas.openxmlformats.org/drawingml/2006/main" xmlns:pic="http://schemas.openxmlformats.org/drawingml/2006/picture">
             <wp:extent cx="5486400" cy="2873829"/>
-            <wp:docPr id="5" name="Picture 5"/>
+            <wp:docPr id="7" name="Picture 7"/>
             <wp:cNvGraphicFramePr>
               <a:graphicFrameLocks noChangeAspect="1"/>
             </wp:cNvGraphicFramePr>
@@ -4615,7 +4901,7 @@
                     <pic:cNvPicPr/>
                   </pic:nvPicPr>
                   <pic:blipFill>
-                    <a:blip r:embed="rId15"/>
+                    <a:blip r:embed="rId17"/>
                     <a:stretch>
                       <a:fillRect/>
                     </a:stretch>
@@ -4646,7 +4932,7 @@
           <w:i/>
           <w:sz w:val="20"/>
         </w:rPr>
-        <w:t>Figure 4.2: Dockerized Multi-Container Network &amp; Volumes Topology Diagram</w:t>
+        <w:t>Figure 4.7: Dockerized Multi-Container Network &amp; Volumes Topology Diagram</w:t>
       </w:r>
     </w:p>
     <w:p>
@@ -4660,7 +4946,7 @@
           <w:i/>
           <w:sz w:val="24"/>
         </w:rPr>
-        <w:t>Figure 4.2 highlights container mappings inside the private bridge network, indicating volume data storage and mapping setups sidecar ports.</w:t>
+        <w:t>Figure 4.7 highlights container mappings inside the private bridge network, indicating volume data storage and mapping setups sidecar ports.</w:t>
       </w:r>
     </w:p>
     <w:p>
@@ -4671,7 +4957,7 @@
         <w:drawing>
           <wp:inline xmlns:a="http://schemas.openxmlformats.org/drawingml/2006/main" xmlns:pic="http://schemas.openxmlformats.org/drawingml/2006/picture">
             <wp:extent cx="5486400" cy="2873829"/>
-            <wp:docPr id="6" name="Picture 6"/>
+            <wp:docPr id="8" name="Picture 8"/>
             <wp:cNvGraphicFramePr>
               <a:graphicFrameLocks noChangeAspect="1"/>
             </wp:cNvGraphicFramePr>
@@ -4683,7 +4969,7 @@
                     <pic:cNvPicPr/>
                   </pic:nvPicPr>
                   <pic:blipFill>
-                    <a:blip r:embed="rId16"/>
+                    <a:blip r:embed="rId18"/>
                     <a:stretch>
                       <a:fillRect/>
                     </a:stretch>
@@ -4714,7 +5000,7 @@
           <w:i/>
           <w:sz w:val="20"/>
         </w:rPr>
-        <w:t>Figure 4.5: Enterprise Deployment Topology with Port Mappings</w:t>
+        <w:t>Figure 4.8: Enterprise Deployment Topology with Port Mappings</w:t>
       </w:r>
     </w:p>
     <w:p>
@@ -4728,7 +5014,7 @@
           <w:i/>
           <w:sz w:val="24"/>
         </w:rPr>
-        <w:t>Figure 4.5 describes server execution environments mapping host virtual ports to individual containers.</w:t>
+        <w:t>Figure 4.8 describes server execution environments mapping host virtual ports to individual containers.</w:t>
       </w:r>
     </w:p>
     <w:p>
@@ -4747,9 +5033,9 @@
           <w:rFonts w:ascii="Times New Roman" w:hAnsi="Times New Roman"/>
           <w:b/>
           <w:color w:val="000000"/>
-          <w:sz w:val="32"/>
+          <w:sz w:val="28"/>
         </w:rPr>
-        <w:t>CHAPTER 5: TECHNOLOGY STACK</w:t>
+        <w:t>CHAPTER 5: DETAILED TECHNOLOGY STACK</w:t>
       </w:r>
     </w:p>
     <w:p>
@@ -4763,9 +5049,9 @@
           <w:rFonts w:ascii="Times New Roman" w:hAnsi="Times New Roman"/>
           <w:b/>
           <w:color w:val="323232"/>
-          <w:sz w:val="28"/>
+          <w:sz w:val="24"/>
         </w:rPr>
-        <w:t>5.1 Java 17 &amp; Servlet API</w:t>
+        <w:t>5.1 Java 17 LTS Backend &amp; Servlet API Engine</w:t>
       </w:r>
     </w:p>
     <w:p>
@@ -4792,9 +5078,9 @@
           <w:rFonts w:ascii="Times New Roman" w:hAnsi="Times New Roman"/>
           <w:b/>
           <w:color w:val="323232"/>
-          <w:sz w:val="28"/>
+          <w:sz w:val="24"/>
         </w:rPr>
-        <w:t>5.2 Leaflet.js Mapping Client</w:t>
+        <w:t>5.2 Leaflet Map Interface Rendering Framework</w:t>
       </w:r>
     </w:p>
     <w:p>
@@ -4821,9 +5107,9 @@
           <w:rFonts w:ascii="Times New Roman" w:hAnsi="Times New Roman"/>
           <w:b/>
           <w:color w:val="323232"/>
-          <w:sz w:val="28"/>
+          <w:sz w:val="24"/>
         </w:rPr>
-        <w:t>5.3 PostgreSQL &amp; PostGIS</w:t>
+        <w:t>5.3 PostgreSQL Database &amp; PostGIS Extensions</w:t>
       </w:r>
     </w:p>
     <w:p>
@@ -4850,9 +5136,9 @@
           <w:rFonts w:ascii="Times New Roman" w:hAnsi="Times New Roman"/>
           <w:b/>
           <w:color w:val="323232"/>
-          <w:sz w:val="28"/>
+          <w:sz w:val="24"/>
         </w:rPr>
-        <w:t>5.4 GeoServer (Kartoza build)</w:t>
+        <w:t>5.4 GeoServer GIS Map Publishing Engine</w:t>
       </w:r>
     </w:p>
     <w:p>
@@ -4879,9 +5165,9 @@
           <w:rFonts w:ascii="Times New Roman" w:hAnsi="Times New Roman"/>
           <w:b/>
           <w:color w:val="323232"/>
-          <w:sz w:val="28"/>
+          <w:sz w:val="24"/>
         </w:rPr>
-        <w:t>5.5 Apache Tomcat 9</w:t>
+        <w:t>5.5 Apache Tomcat Server &amp; Maven Build Tool</w:t>
       </w:r>
     </w:p>
     <w:p>
@@ -4898,6 +5184,27 @@
       </w:r>
     </w:p>
     <w:p>
+      <w:r>
+        <w:br w:type="page"/>
+      </w:r>
+    </w:p>
+    <w:p>
+      <w:pPr>
+        <w:pStyle w:val="Heading1"/>
+        <w:keepNext/>
+        <w:spacing w:before="480" w:after="240"/>
+      </w:pPr>
+      <w:r>
+        <w:rPr>
+          <w:rFonts w:ascii="Times New Roman" w:hAnsi="Times New Roman"/>
+          <w:b/>
+          <w:color w:val="000000"/>
+          <w:sz w:val="28"/>
+        </w:rPr>
+        <w:t>CHAPTER 6: PROJECT IMPLEMENTATION</w:t>
+      </w:r>
+    </w:p>
+    <w:p>
       <w:pPr>
         <w:pStyle w:val="Heading2"/>
         <w:keepNext/>
@@ -4908,88 +5215,9 @@
           <w:rFonts w:ascii="Times New Roman" w:hAnsi="Times New Roman"/>
           <w:b/>
           <w:color w:val="323232"/>
-          <w:sz w:val="28"/>
-        </w:rPr>
-        <w:t>5.6 Docker &amp; Compose</w:t>
-      </w:r>
-    </w:p>
-    <w:p>
-      <w:pPr>
-        <w:spacing w:before="0" w:after="120" w:line="360" w:lineRule="auto"/>
-        <w:jc w:val="both"/>
-      </w:pPr>
-      <w:r>
-        <w:rPr>
-          <w:rFonts w:ascii="Times New Roman" w:hAnsi="Times New Roman"/>
           <w:sz w:val="24"/>
         </w:rPr>
-        <w:t>The infrastructure layer. Standardizes execution files across Linux and Windows. Automates dependencies setup (Java, Tomcat, DB, GIS) through isolated container processes on a virtual bridge network.</w:t>
-      </w:r>
-    </w:p>
-    <w:p>
-      <w:pPr>
-        <w:pStyle w:val="Heading2"/>
-        <w:keepNext/>
-        <w:spacing w:before="240" w:after="120"/>
-      </w:pPr>
-      <w:r>
-        <w:rPr>
-          <w:rFonts w:ascii="Times New Roman" w:hAnsi="Times New Roman"/>
-          <w:b/>
-          <w:color w:val="323232"/>
-          <w:sz w:val="28"/>
-        </w:rPr>
-        <w:t>5.7 Maven Build Tool</w:t>
-      </w:r>
-    </w:p>
-    <w:p>
-      <w:pPr>
-        <w:spacing w:before="0" w:after="120" w:line="360" w:lineRule="auto"/>
-        <w:jc w:val="both"/>
-      </w:pPr>
-      <w:r>
-        <w:rPr>
-          <w:rFonts w:ascii="Times New Roman" w:hAnsi="Times New Roman"/>
-          <w:sz w:val="24"/>
-        </w:rPr>
-        <w:t>The package manager. Standardizes compilation steps. Generates the single deployable WAR package incorporating both frontend files and Java bytecode classes.</w:t>
-      </w:r>
-    </w:p>
-    <w:p>
-      <w:r>
-        <w:br w:type="page"/>
-      </w:r>
-    </w:p>
-    <w:p>
-      <w:pPr>
-        <w:pStyle w:val="Heading1"/>
-        <w:keepNext/>
-        <w:spacing w:before="480" w:after="240"/>
-      </w:pPr>
-      <w:r>
-        <w:rPr>
-          <w:rFonts w:ascii="Times New Roman" w:hAnsi="Times New Roman"/>
-          <w:b/>
-          <w:color w:val="000000"/>
-          <w:sz w:val="32"/>
-        </w:rPr>
-        <w:t>CHAPTER 6: PROJECT IMPLEMENTATION</w:t>
-      </w:r>
-    </w:p>
-    <w:p>
-      <w:pPr>
-        <w:pStyle w:val="Heading2"/>
-        <w:keepNext/>
-        <w:spacing w:before="240" w:after="120"/>
-      </w:pPr>
-      <w:r>
-        <w:rPr>
-          <w:rFonts w:ascii="Times New Roman" w:hAnsi="Times New Roman"/>
-          <w:b/>
-          <w:color w:val="323232"/>
-          <w:sz w:val="28"/>
-        </w:rPr>
-        <w:t>6.1 Security &amp; Session Authorization Filters</w:t>
+        <w:t>6.1 Security Gateways &amp; BCrypt Hash Filters</w:t>
       </w:r>
     </w:p>
     <w:p>
@@ -5066,9 +5294,9 @@
           <w:rFonts w:ascii="Times New Roman" w:hAnsi="Times New Roman"/>
           <w:b/>
           <w:color w:val="323232"/>
-          <w:sz w:val="28"/>
+          <w:sz w:val="24"/>
         </w:rPr>
-        <w:t>6.2 Real-Time Asset Ingestion Loop</w:t>
+        <w:t>6.2 Real-Time Asset Tracking Loop</w:t>
       </w:r>
     </w:p>
     <w:p>
@@ -5161,7 +5389,7 @@
           <w:rFonts w:ascii="Times New Roman" w:hAnsi="Times New Roman"/>
           <w:b/>
           <w:color w:val="323232"/>
-          <w:sz w:val="28"/>
+          <w:sz w:val="24"/>
         </w:rPr>
         <w:t>6.3 Stored Database Functions &amp; Alert Triggers</w:t>
       </w:r>
@@ -5190,7 +5418,7 @@
           <w:rFonts w:ascii="Times New Roman" w:hAnsi="Times New Roman"/>
           <w:b/>
           <w:color w:val="323232"/>
-          <w:sz w:val="28"/>
+          <w:sz w:val="24"/>
         </w:rPr>
         <w:t>6.4 Analytical Reports Compilation</w:t>
       </w:r>
@@ -5224,7 +5452,7 @@
           <w:rFonts w:ascii="Times New Roman" w:hAnsi="Times New Roman"/>
           <w:b/>
           <w:color w:val="000000"/>
-          <w:sz w:val="32"/>
+          <w:sz w:val="28"/>
         </w:rPr>
         <w:t>CHAPTER 7: DATABASE ARCHITECTURE</w:t>
       </w:r>
@@ -5240,7 +5468,7 @@
           <w:rFonts w:ascii="Times New Roman" w:hAnsi="Times New Roman"/>
           <w:b/>
           <w:color w:val="323232"/>
-          <w:sz w:val="28"/>
+          <w:sz w:val="24"/>
         </w:rPr>
         <w:t>7.1 Schema Definitions &amp; Data Dictionary</w:t>
       </w:r>
@@ -5292,9 +5520,92 @@
           <w:rFonts w:ascii="Times New Roman" w:hAnsi="Times New Roman"/>
           <w:b/>
           <w:color w:val="323232"/>
-          <w:sz w:val="28"/>
+          <w:sz w:val="24"/>
         </w:rPr>
-        <w:t>7.2 Database Stored Procedures</w:t>
+        <w:t>7.2 Database Table DDL Scripts</w:t>
+      </w:r>
+    </w:p>
+    <w:p>
+      <w:pPr>
+        <w:spacing w:before="0" w:after="120" w:line="360" w:lineRule="auto"/>
+        <w:jc w:val="both"/>
+      </w:pPr>
+      <w:r>
+        <w:rPr>
+          <w:rFonts w:ascii="Times New Roman" w:hAnsi="Times New Roman"/>
+          <w:sz w:val="24"/>
+        </w:rPr>
+        <w:t>SQL DDL Schema definition code executing inside PostgreSQL container:</w:t>
+      </w:r>
+    </w:p>
+    <w:p>
+      <w:pPr>
+        <w:spacing w:before="120" w:after="120" w:line="276" w:lineRule="auto"/>
+        <w:jc w:val="left"/>
+        <w:pBdr>
+          <w:left w:val="single" w:sz="24" w:space="12" w:color="A0A0A0"/>
+        </w:pBdr>
+        <w:shd w:fill="F5F5F5"/>
+      </w:pPr>
+      <w:r>
+        <w:rPr>
+          <w:rFonts w:ascii="Consolas" w:hAnsi="Consolas"/>
+          <w:color w:val="282828"/>
+          <w:sz w:val="19"/>
+        </w:rPr>
+        <w:t>-- DDL script for asset tracking schema</w:t>
+        <w:br/>
+        <w:t>CREATE EXTENSION IF NOT EXISTS postgis;</w:t>
+        <w:br/>
+        <w:br/>
+        <w:t>CREATE TABLE assets (</w:t>
+        <w:br/>
+        <w:t xml:space="preserve">    id SERIAL PRIMARY KEY,</w:t>
+        <w:br/>
+        <w:t xml:space="preserve">    asset_name VARCHAR(100) NOT NULL,</w:t>
+        <w:br/>
+        <w:t xml:space="preserve">    asset_type VARCHAR(50) NOT NULL,</w:t>
+        <w:br/>
+        <w:t xml:space="preserve">    asset_code VARCHAR(30) UNIQUE NOT NULL,</w:t>
+        <w:br/>
+        <w:t xml:space="preserve">    status VARCHAR(20) DEFAULT 'ACTIVE'</w:t>
+        <w:br/>
+        <w:t>);</w:t>
+        <w:br/>
+        <w:br/>
+        <w:t>CREATE TABLE asset_positions (</w:t>
+        <w:br/>
+        <w:t xml:space="preserve">    id SERIAL PRIMARY KEY,</w:t>
+        <w:br/>
+        <w:t xml:space="preserve">    asset_id INTEGER REFERENCES assets(id) ON DELETE CASCADE,</w:t>
+        <w:br/>
+        <w:t xml:space="preserve">    geom GEOMETRY(Point, 4326) NOT NULL,</w:t>
+        <w:br/>
+        <w:t xml:space="preserve">    speed DOUBLE PRECISION DEFAULT 0.0,</w:t>
+        <w:br/>
+        <w:t xml:space="preserve">    heading DOUBLE PRECISION DEFAULT 0.0,</w:t>
+        <w:br/>
+        <w:t xml:space="preserve">    recorded_at TIMESTAMP WITH TIME ZONE DEFAULT CURRENT_TIMESTAMP</w:t>
+        <w:br/>
+        <w:t>);</w:t>
+        <w:br/>
+        <w:t>CREATE INDEX idx_asset_positions_geom ON asset_positions USING GIST(geom);</w:t>
+      </w:r>
+    </w:p>
+    <w:p>
+      <w:pPr>
+        <w:pStyle w:val="Heading2"/>
+        <w:keepNext/>
+        <w:spacing w:before="240" w:after="120"/>
+      </w:pPr>
+      <w:r>
+        <w:rPr>
+          <w:rFonts w:ascii="Times New Roman" w:hAnsi="Times New Roman"/>
+          <w:b/>
+          <w:color w:val="323232"/>
+          <w:sz w:val="24"/>
+        </w:rPr>
+        <w:t>7.3 Topological Queries &amp; Spatial Triggers</w:t>
       </w:r>
     </w:p>
     <w:p>
@@ -5396,7 +5707,7 @@
           <w:rFonts w:ascii="Times New Roman" w:hAnsi="Times New Roman"/>
           <w:b/>
           <w:color w:val="000000"/>
-          <w:sz w:val="32"/>
+          <w:sz w:val="28"/>
         </w:rPr>
         <w:t>CHAPTER 8: DOCKER CONTAINERIZATION</w:t>
       </w:r>
@@ -5412,7 +5723,7 @@
           <w:rFonts w:ascii="Times New Roman" w:hAnsi="Times New Roman"/>
           <w:b/>
           <w:color w:val="323232"/>
-          <w:sz w:val="28"/>
+          <w:sz w:val="24"/>
         </w:rPr>
         <w:t>8.1 Multi-Stage Maven-to-Tomcat Dockerfile</w:t>
       </w:r>
@@ -5492,7 +5803,7 @@
           <w:rFonts w:ascii="Times New Roman" w:hAnsi="Times New Roman"/>
           <w:b/>
           <w:color w:val="323232"/>
-          <w:sz w:val="28"/>
+          <w:sz w:val="24"/>
         </w:rPr>
         <w:t>8.2 Docker Compose Stack Configuration</w:t>
       </w:r>
@@ -5521,7 +5832,7 @@
           <w:rFonts w:ascii="Times New Roman" w:hAnsi="Times New Roman"/>
           <w:b/>
           <w:color w:val="323232"/>
-          <w:sz w:val="28"/>
+          <w:sz w:val="24"/>
         </w:rPr>
         <w:t>8.3 GeoServer Setup Orchestration Sidecar</w:t>
       </w:r>
@@ -5555,7 +5866,7 @@
           <w:rFonts w:ascii="Times New Roman" w:hAnsi="Times New Roman"/>
           <w:b/>
           <w:color w:val="000000"/>
-          <w:sz w:val="32"/>
+          <w:sz w:val="28"/>
         </w:rPr>
         <w:t>CHAPTER 9: VERIFICATION &amp; TESTING</w:t>
       </w:r>
@@ -5571,7 +5882,7 @@
           <w:rFonts w:ascii="Times New Roman" w:hAnsi="Times New Roman"/>
           <w:b/>
           <w:color w:val="323232"/>
-          <w:sz w:val="28"/>
+          <w:sz w:val="24"/>
         </w:rPr>
         <w:t>9.1 Stored Logic Verification</w:t>
       </w:r>
@@ -5600,7 +5911,7 @@
           <w:rFonts w:ascii="Times New Roman" w:hAnsi="Times New Roman"/>
           <w:b/>
           <w:color w:val="323232"/>
-          <w:sz w:val="28"/>
+          <w:sz w:val="24"/>
         </w:rPr>
         <w:t>9.2 API Request/Response Integration Logs</w:t>
       </w:r>
@@ -5663,9 +5974,9 @@
           <w:rFonts w:ascii="Times New Roman" w:hAnsi="Times New Roman"/>
           <w:b/>
           <w:color w:val="323232"/>
-          <w:sz w:val="28"/>
+          <w:sz w:val="24"/>
         </w:rPr>
-        <w:t>9.3 Docker Deployment Verification Logs</w:t>
+        <w:t>9.3 Docker Deployment Logs</w:t>
       </w:r>
     </w:p>
     <w:p>
@@ -5697,7 +6008,7 @@
           <w:rFonts w:ascii="Times New Roman" w:hAnsi="Times New Roman"/>
           <w:b/>
           <w:color w:val="000000"/>
-          <w:sz w:val="32"/>
+          <w:sz w:val="28"/>
         </w:rPr>
         <w:t>CHAPTER 10: RESULTS &amp; ADVANTAGES</w:t>
       </w:r>
@@ -5713,7 +6024,7 @@
           <w:rFonts w:ascii="Times New Roman" w:hAnsi="Times New Roman"/>
           <w:b/>
           <w:color w:val="323232"/>
-          <w:sz w:val="28"/>
+          <w:sz w:val="24"/>
         </w:rPr>
         <w:t>10.1 UI Layout Showcase &amp; Performance Checks</w:t>
       </w:r>
@@ -5739,7 +6050,7 @@
         <w:drawing>
           <wp:inline xmlns:a="http://schemas.openxmlformats.org/drawingml/2006/main" xmlns:pic="http://schemas.openxmlformats.org/drawingml/2006/picture">
             <wp:extent cx="4572000" cy="3362107"/>
-            <wp:docPr id="7" name="Picture 7"/>
+            <wp:docPr id="9" name="Picture 9"/>
             <wp:cNvGraphicFramePr>
               <a:graphicFrameLocks noChangeAspect="1"/>
             </wp:cNvGraphicFramePr>
@@ -5751,7 +6062,7 @@
                     <pic:cNvPicPr/>
                   </pic:nvPicPr>
                   <pic:blipFill>
-                    <a:blip r:embed="rId17"/>
+                    <a:blip r:embed="rId19"/>
                     <a:stretch>
                       <a:fillRect/>
                     </a:stretch>
@@ -5807,7 +6118,7 @@
         <w:drawing>
           <wp:inline xmlns:a="http://schemas.openxmlformats.org/drawingml/2006/main" xmlns:pic="http://schemas.openxmlformats.org/drawingml/2006/picture">
             <wp:extent cx="4572000" cy="2090738"/>
-            <wp:docPr id="8" name="Picture 8"/>
+            <wp:docPr id="10" name="Picture 10"/>
             <wp:cNvGraphicFramePr>
               <a:graphicFrameLocks noChangeAspect="1"/>
             </wp:cNvGraphicFramePr>
@@ -5819,7 +6130,7 @@
                     <pic:cNvPicPr/>
                   </pic:nvPicPr>
                   <pic:blipFill>
-                    <a:blip r:embed="rId18"/>
+                    <a:blip r:embed="rId20"/>
                     <a:stretch>
                       <a:fillRect/>
                     </a:stretch>
@@ -5875,7 +6186,7 @@
         <w:drawing>
           <wp:inline xmlns:a="http://schemas.openxmlformats.org/drawingml/2006/main" xmlns:pic="http://schemas.openxmlformats.org/drawingml/2006/picture">
             <wp:extent cx="4572000" cy="2462525"/>
-            <wp:docPr id="9" name="Picture 9"/>
+            <wp:docPr id="11" name="Picture 11"/>
             <wp:cNvGraphicFramePr>
               <a:graphicFrameLocks noChangeAspect="1"/>
             </wp:cNvGraphicFramePr>
@@ -5884,142 +6195,6 @@
                 <pic:pic>
                   <pic:nvPicPr>
                     <pic:cNvPr id="0" name="landing.png"/>
-                    <pic:cNvPicPr/>
-                  </pic:nvPicPr>
-                  <pic:blipFill>
-                    <a:blip r:embed="rId19"/>
-                    <a:stretch>
-                      <a:fillRect/>
-                    </a:stretch>
-                  </pic:blipFill>
-                  <pic:spPr>
-                    <a:xfrm>
-                      <a:off x="0" y="0"/>
-                      <a:ext cx="4572000" cy="2462525"/>
-                    </a:xfrm>
-                    <a:prstGeom prst="rect"/>
-                  </pic:spPr>
-                </pic:pic>
-              </a:graphicData>
-            </a:graphic>
-          </wp:inline>
-        </w:drawing>
-      </w:r>
-    </w:p>
-    <w:p>
-      <w:pPr>
-        <w:spacing w:before="80" w:after="240"/>
-        <w:jc w:val="center"/>
-      </w:pPr>
-      <w:r>
-        <w:rPr>
-          <w:rFonts w:ascii="Times New Roman" w:hAnsi="Times New Roman"/>
-          <w:b/>
-          <w:i/>
-          <w:sz w:val="20"/>
-        </w:rPr>
-        <w:t>Figure 10.3: Tactical Portal Welcome Page - Welcome Landing Interface</w:t>
-      </w:r>
-    </w:p>
-    <w:p>
-      <w:pPr>
-        <w:spacing w:before="0" w:after="120" w:line="360" w:lineRule="auto"/>
-        <w:jc w:val="both"/>
-      </w:pPr>
-      <w:r>
-        <w:rPr>
-          <w:rFonts w:ascii="Times New Roman" w:hAnsi="Times New Roman"/>
-          <w:i/>
-          <w:sz w:val="24"/>
-        </w:rPr>
-        <w:t>Figure 10.3 presents the dark-themed tactical portal landing page. It showcases system stats, active users counts, and link paths to the main login portal.</w:t>
-      </w:r>
-    </w:p>
-    <w:p>
-      <w:pPr>
-        <w:jc w:val="center"/>
-      </w:pPr>
-      <w:r>
-        <w:drawing>
-          <wp:inline xmlns:a="http://schemas.openxmlformats.org/drawingml/2006/main" xmlns:pic="http://schemas.openxmlformats.org/drawingml/2006/picture">
-            <wp:extent cx="4572000" cy="2462525"/>
-            <wp:docPr id="10" name="Picture 10"/>
-            <wp:cNvGraphicFramePr>
-              <a:graphicFrameLocks noChangeAspect="1"/>
-            </wp:cNvGraphicFramePr>
-            <a:graphic>
-              <a:graphicData uri="http://schemas.openxmlformats.org/drawingml/2006/picture">
-                <pic:pic>
-                  <pic:nvPicPr>
-                    <pic:cNvPr id="0" name="login.png"/>
-                    <pic:cNvPicPr/>
-                  </pic:nvPicPr>
-                  <pic:blipFill>
-                    <a:blip r:embed="rId20"/>
-                    <a:stretch>
-                      <a:fillRect/>
-                    </a:stretch>
-                  </pic:blipFill>
-                  <pic:spPr>
-                    <a:xfrm>
-                      <a:off x="0" y="0"/>
-                      <a:ext cx="4572000" cy="2462525"/>
-                    </a:xfrm>
-                    <a:prstGeom prst="rect"/>
-                  </pic:spPr>
-                </pic:pic>
-              </a:graphicData>
-            </a:graphic>
-          </wp:inline>
-        </w:drawing>
-      </w:r>
-    </w:p>
-    <w:p>
-      <w:pPr>
-        <w:spacing w:before="80" w:after="240"/>
-        <w:jc w:val="center"/>
-      </w:pPr>
-      <w:r>
-        <w:rPr>
-          <w:rFonts w:ascii="Times New Roman" w:hAnsi="Times New Roman"/>
-          <w:b/>
-          <w:i/>
-          <w:sz w:val="20"/>
-        </w:rPr>
-        <w:t>Figure 10.4: Secure Portal Authentication Panel - Portal Authentication and BCrypt Verification Page</w:t>
-      </w:r>
-    </w:p>
-    <w:p>
-      <w:pPr>
-        <w:spacing w:before="0" w:after="120" w:line="360" w:lineRule="auto"/>
-        <w:jc w:val="both"/>
-      </w:pPr>
-      <w:r>
-        <w:rPr>
-          <w:rFonts w:ascii="Times New Roman" w:hAnsi="Times New Roman"/>
-          <w:i/>
-          <w:sz w:val="24"/>
-        </w:rPr>
-        <w:t>Figure 10.4 shows the secure portal login page, enforcing BCrypt authentication filters and guarding user sessions before exposing operational views.</w:t>
-      </w:r>
-    </w:p>
-    <w:p>
-      <w:pPr>
-        <w:jc w:val="center"/>
-      </w:pPr>
-      <w:r>
-        <w:drawing>
-          <wp:inline xmlns:a="http://schemas.openxmlformats.org/drawingml/2006/main" xmlns:pic="http://schemas.openxmlformats.org/drawingml/2006/picture">
-            <wp:extent cx="4572000" cy="2462525"/>
-            <wp:docPr id="11" name="Picture 11"/>
-            <wp:cNvGraphicFramePr>
-              <a:graphicFrameLocks noChangeAspect="1"/>
-            </wp:cNvGraphicFramePr>
-            <a:graphic>
-              <a:graphicData uri="http://schemas.openxmlformats.org/drawingml/2006/picture">
-                <pic:pic>
-                  <pic:nvPicPr>
-                    <pic:cNvPr id="0" name="dashboard.png"/>
                     <pic:cNvPicPr/>
                   </pic:nvPicPr>
                   <pic:blipFill>
@@ -6054,7 +6229,7 @@
           <w:i/>
           <w:sz w:val="20"/>
         </w:rPr>
-        <w:t>Figure 10.5: Operational Dashboard Statistics - Real-Time Fleet &amp; perimeter Alerts KPI Metrics Panel</w:t>
+        <w:t>Figure 10.3: Tactical Portal Welcome Page - Welcome Landing Interface</w:t>
       </w:r>
     </w:p>
     <w:p>
@@ -6068,7 +6243,7 @@
           <w:i/>
           <w:sz w:val="24"/>
         </w:rPr>
-        <w:t>Figure 10.5 highlights the real-time operational dashboard compiling active combat units, geofenced boundaries, and unacknowledged breach alerts.</w:t>
+        <w:t>Figure 10.3 presents the dark-themed tactical portal landing page. It showcases system stats, active users counts, and link paths to the main login portal.</w:t>
       </w:r>
     </w:p>
     <w:p>
@@ -6087,7 +6262,7 @@
               <a:graphicData uri="http://schemas.openxmlformats.org/drawingml/2006/picture">
                 <pic:pic>
                   <pic:nvPicPr>
-                    <pic:cNvPr id="0" name="tracking.png"/>
+                    <pic:cNvPr id="0" name="login.png"/>
                     <pic:cNvPicPr/>
                   </pic:nvPicPr>
                   <pic:blipFill>
@@ -6122,7 +6297,7 @@
           <w:i/>
           <w:sz w:val="20"/>
         </w:rPr>
-        <w:t>Figure 10.6: Live Mapping Tracking Interface - Real-Time Map Tracker Overlay</w:t>
+        <w:t>Figure 10.4: Secure Portal Authentication Panel - Portal Authentication and BCrypt Verification Page</w:t>
       </w:r>
     </w:p>
     <w:p>
@@ -6136,7 +6311,7 @@
           <w:i/>
           <w:sz w:val="24"/>
         </w:rPr>
-        <w:t>Figure 10.6 showcases the interactive Leaflet mapping dashboard displaying live telemetry coordinates and active tracks overlay.</w:t>
+        <w:t>Figure 10.4 shows the secure portal login page, enforcing BCrypt authentication filters and guarding user sessions before exposing operational views.</w:t>
       </w:r>
     </w:p>
     <w:p>
@@ -6155,7 +6330,7 @@
               <a:graphicData uri="http://schemas.openxmlformats.org/drawingml/2006/picture">
                 <pic:pic>
                   <pic:nvPicPr>
-                    <pic:cNvPr id="0" name="geofence.png"/>
+                    <pic:cNvPr id="0" name="dashboard.png"/>
                     <pic:cNvPicPr/>
                   </pic:nvPicPr>
                   <pic:blipFill>
@@ -6190,7 +6365,7 @@
           <w:i/>
           <w:sz w:val="20"/>
         </w:rPr>
-        <w:t>Figure 10.7: Perimeter Geofencing restricted boundaries - Perimeter Geofencing Restricted &amp; Warning Zones Map</w:t>
+        <w:t>Figure 10.5: Operational Dashboard Statistics - Real-Time Fleet &amp; perimeter Alerts KPI Metrics Panel</w:t>
       </w:r>
     </w:p>
     <w:p>
@@ -6204,7 +6379,7 @@
           <w:i/>
           <w:sz w:val="24"/>
         </w:rPr>
-        <w:t>Figure 10.7 illustrates the geofencing layer displaying restricted sectors (red polygons) and warning perimeter boundaries (orange polygons).</w:t>
+        <w:t>Figure 10.5 highlights the real-time operational dashboard compiling active combat units, geofenced boundaries, and unacknowledged breach alerts.</w:t>
       </w:r>
     </w:p>
     <w:p>
@@ -6223,7 +6398,7 @@
               <a:graphicData uri="http://schemas.openxmlformats.org/drawingml/2006/picture">
                 <pic:pic>
                   <pic:nvPicPr>
-                    <pic:cNvPr id="0" name="alerts.png"/>
+                    <pic:cNvPr id="0" name="tracking.png"/>
                     <pic:cNvPicPr/>
                   </pic:nvPicPr>
                   <pic:blipFill>
@@ -6258,7 +6433,7 @@
           <w:i/>
           <w:sz w:val="20"/>
         </w:rPr>
-        <w:t>Figure 10.8: Breach Alarm Event Log Grid - Breach Detection Alarms Logs Registry</w:t>
+        <w:t>Figure 10.6: Live Mapping Tracking Interface - Real-Time Map Tracker Overlay</w:t>
       </w:r>
     </w:p>
     <w:p>
@@ -6272,7 +6447,7 @@
           <w:i/>
           <w:sz w:val="24"/>
         </w:rPr>
-        <w:t>Figure 10.8 presents the active alerts grid, recording violating assets, breached zones, entry/exit timestamp, and operator actions.</w:t>
+        <w:t>Figure 10.6 showcases the interactive Leaflet mapping dashboard displaying live telemetry coordinates and active tracks overlay.</w:t>
       </w:r>
     </w:p>
     <w:p>
@@ -6291,7 +6466,7 @@
               <a:graphicData uri="http://schemas.openxmlformats.org/drawingml/2006/picture">
                 <pic:pic>
                   <pic:nvPicPr>
-                    <pic:cNvPr id="0" name="reports.png"/>
+                    <pic:cNvPr id="0" name="geofence.png"/>
                     <pic:cNvPicPr/>
                   </pic:nvPicPr>
                   <pic:blipFill>
@@ -6326,6 +6501,142 @@
           <w:i/>
           <w:sz w:val="20"/>
         </w:rPr>
+        <w:t>Figure 10.7: Perimeter Geofencing restricted boundaries - Perimeter Geofencing Restricted &amp; Warning Zones Map</w:t>
+      </w:r>
+    </w:p>
+    <w:p>
+      <w:pPr>
+        <w:spacing w:before="0" w:after="120" w:line="360" w:lineRule="auto"/>
+        <w:jc w:val="both"/>
+      </w:pPr>
+      <w:r>
+        <w:rPr>
+          <w:rFonts w:ascii="Times New Roman" w:hAnsi="Times New Roman"/>
+          <w:i/>
+          <w:sz w:val="24"/>
+        </w:rPr>
+        <w:t>Figure 10.7 illustrates the geofencing layer displaying restricted sectors (red polygons) and warning perimeter boundaries (orange polygons).</w:t>
+      </w:r>
+    </w:p>
+    <w:p>
+      <w:pPr>
+        <w:jc w:val="center"/>
+      </w:pPr>
+      <w:r>
+        <w:drawing>
+          <wp:inline xmlns:a="http://schemas.openxmlformats.org/drawingml/2006/main" xmlns:pic="http://schemas.openxmlformats.org/drawingml/2006/picture">
+            <wp:extent cx="4572000" cy="2462525"/>
+            <wp:docPr id="16" name="Picture 16"/>
+            <wp:cNvGraphicFramePr>
+              <a:graphicFrameLocks noChangeAspect="1"/>
+            </wp:cNvGraphicFramePr>
+            <a:graphic>
+              <a:graphicData uri="http://schemas.openxmlformats.org/drawingml/2006/picture">
+                <pic:pic>
+                  <pic:nvPicPr>
+                    <pic:cNvPr id="0" name="alerts.png"/>
+                    <pic:cNvPicPr/>
+                  </pic:nvPicPr>
+                  <pic:blipFill>
+                    <a:blip r:embed="rId26"/>
+                    <a:stretch>
+                      <a:fillRect/>
+                    </a:stretch>
+                  </pic:blipFill>
+                  <pic:spPr>
+                    <a:xfrm>
+                      <a:off x="0" y="0"/>
+                      <a:ext cx="4572000" cy="2462525"/>
+                    </a:xfrm>
+                    <a:prstGeom prst="rect"/>
+                  </pic:spPr>
+                </pic:pic>
+              </a:graphicData>
+            </a:graphic>
+          </wp:inline>
+        </w:drawing>
+      </w:r>
+    </w:p>
+    <w:p>
+      <w:pPr>
+        <w:spacing w:before="80" w:after="240"/>
+        <w:jc w:val="center"/>
+      </w:pPr>
+      <w:r>
+        <w:rPr>
+          <w:rFonts w:ascii="Times New Roman" w:hAnsi="Times New Roman"/>
+          <w:b/>
+          <w:i/>
+          <w:sz w:val="20"/>
+        </w:rPr>
+        <w:t>Figure 10.8: Breach Alarm Event Log Grid - Breach Detection Alarms Logs Registry</w:t>
+      </w:r>
+    </w:p>
+    <w:p>
+      <w:pPr>
+        <w:spacing w:before="0" w:after="120" w:line="360" w:lineRule="auto"/>
+        <w:jc w:val="both"/>
+      </w:pPr>
+      <w:r>
+        <w:rPr>
+          <w:rFonts w:ascii="Times New Roman" w:hAnsi="Times New Roman"/>
+          <w:i/>
+          <w:sz w:val="24"/>
+        </w:rPr>
+        <w:t>Figure 10.8 presents the active alerts grid, recording violating assets, breached zones, entry/exit timestamp, and operator actions.</w:t>
+      </w:r>
+    </w:p>
+    <w:p>
+      <w:pPr>
+        <w:jc w:val="center"/>
+      </w:pPr>
+      <w:r>
+        <w:drawing>
+          <wp:inline xmlns:a="http://schemas.openxmlformats.org/drawingml/2006/main" xmlns:pic="http://schemas.openxmlformats.org/drawingml/2006/picture">
+            <wp:extent cx="4572000" cy="2462525"/>
+            <wp:docPr id="17" name="Picture 17"/>
+            <wp:cNvGraphicFramePr>
+              <a:graphicFrameLocks noChangeAspect="1"/>
+            </wp:cNvGraphicFramePr>
+            <a:graphic>
+              <a:graphicData uri="http://schemas.openxmlformats.org/drawingml/2006/picture">
+                <pic:pic>
+                  <pic:nvPicPr>
+                    <pic:cNvPr id="0" name="reports.png"/>
+                    <pic:cNvPicPr/>
+                  </pic:nvPicPr>
+                  <pic:blipFill>
+                    <a:blip r:embed="rId27"/>
+                    <a:stretch>
+                      <a:fillRect/>
+                    </a:stretch>
+                  </pic:blipFill>
+                  <pic:spPr>
+                    <a:xfrm>
+                      <a:off x="0" y="0"/>
+                      <a:ext cx="4572000" cy="2462525"/>
+                    </a:xfrm>
+                    <a:prstGeom prst="rect"/>
+                  </pic:spPr>
+                </pic:pic>
+              </a:graphicData>
+            </a:graphic>
+          </wp:inline>
+        </w:drawing>
+      </w:r>
+    </w:p>
+    <w:p>
+      <w:pPr>
+        <w:spacing w:before="80" w:after="240"/>
+        <w:jc w:val="center"/>
+      </w:pPr>
+      <w:r>
+        <w:rPr>
+          <w:rFonts w:ascii="Times New Roman" w:hAnsi="Times New Roman"/>
+          <w:b/>
+          <w:i/>
+          <w:sz w:val="20"/>
+        </w:rPr>
         <w:t>Figure 10.9: Analytical Report Compilation Interface - Analytical Reports and Coordinates Query Page</w:t>
       </w:r>
     </w:p>
@@ -6354,7 +6665,7 @@
           <w:rFonts w:ascii="Times New Roman" w:hAnsi="Times New Roman"/>
           <w:b/>
           <w:color w:val="323232"/>
-          <w:sz w:val="28"/>
+          <w:sz w:val="24"/>
         </w:rPr>
         <w:t>10.2 Advantages &amp; Defence Applications</w:t>
       </w:r>
@@ -6388,7 +6699,7 @@
           <w:rFonts w:ascii="Times New Roman" w:hAnsi="Times New Roman"/>
           <w:b/>
           <w:color w:val="000000"/>
-          <w:sz w:val="32"/>
+          <w:sz w:val="28"/>
         </w:rPr>
         <w:t>CHAPTER 11: FUTURE ENHANCEMENTS</w:t>
       </w:r>
@@ -6482,7 +6793,7 @@
           <w:rFonts w:ascii="Times New Roman" w:hAnsi="Times New Roman"/>
           <w:b/>
           <w:color w:val="000000"/>
-          <w:sz w:val="32"/>
+          <w:sz w:val="28"/>
         </w:rPr>
         <w:t>CHAPTER 12: CONCLUSION</w:t>
       </w:r>
@@ -6516,7 +6827,7 @@
           <w:rFonts w:ascii="Times New Roman" w:hAnsi="Times New Roman"/>
           <w:b/>
           <w:color w:val="000000"/>
-          <w:sz w:val="32"/>
+          <w:sz w:val="28"/>
         </w:rPr>
         <w:t>APPENDIX</w:t>
       </w:r>
@@ -6532,7 +6843,7 @@
           <w:rFonts w:ascii="Times New Roman" w:hAnsi="Times New Roman"/>
           <w:b/>
           <w:color w:val="323232"/>
-          <w:sz w:val="28"/>
+          <w:sz w:val="24"/>
         </w:rPr>
         <w:t>Appendix A: Folder Structure Map</w:t>
       </w:r>
@@ -6629,7 +6940,7 @@
           <w:rFonts w:ascii="Times New Roman" w:hAnsi="Times New Roman"/>
           <w:b/>
           <w:color w:val="323232"/>
-          <w:sz w:val="28"/>
+          <w:sz w:val="24"/>
         </w:rPr>
         <w:t>Appendix B: REST API References</w:t>
       </w:r>
@@ -6778,7 +7089,7 @@
           <w:rFonts w:ascii="Times New Roman" w:hAnsi="Times New Roman"/>
           <w:b/>
           <w:color w:val="323232"/>
-          <w:sz w:val="28"/>
+          <w:sz w:val="24"/>
         </w:rPr>
         <w:t>Appendix C: Docker Setup Guidelines</w:t>
       </w:r>
@@ -6852,7 +7163,7 @@
           <w:rFonts w:ascii="Times New Roman" w:hAnsi="Times New Roman"/>
           <w:b/>
           <w:color w:val="000000"/>
-          <w:sz w:val="32"/>
+          <w:sz w:val="28"/>
         </w:rPr>
         <w:t>REFERENCES</w:t>
       </w:r>

</xml_diff>